<commit_message>
correct main things on all the site
</commit_message>
<xml_diff>
--- a/CDC_Resume_AfricaWineFood.docx
+++ b/CDC_Resume_AfricaWineFood.docx
@@ -52,7 +52,7 @@
           <w:sz w:val="28"/>
           <w:szCs w:val="28"/>
         </w:rPr>
-        <w:t xml:space="preserve">VERSION RÉSUMÉE</w:t>
+        <w:t xml:space="preserve">VERSION RÉSUMÉE — V2.0</w:t>
       </w:r>
     </w:p>
     <w:p>
@@ -178,7 +178,7 @@
                 <w:sz w:val="20"/>
                 <w:szCs w:val="20"/>
               </w:rPr>
-              <w:t xml:space="preserve">1.0 Résumée — 13 mai 2026</w:t>
+              <w:t xml:space="preserve">2.0 Résumée — 15 mai 2026</w:t>
             </w:r>
           </w:p>
         </w:tc>
@@ -420,7 +420,7 @@
           <w:sz w:val="21"/>
           <w:szCs w:val="21"/>
         </w:rPr>
-        <w:t xml:space="preserve">Le projet consiste en la création d'un site vitrine premium 6 pages pour renforcer la présence digitale de la marque et générer des prises de contact qualifiées.</w:t>
+        <w:t xml:space="preserve">Le projet consiste en la création d'un site vitrine premium 16 pages pour renforcer la présence digitale de la marque et générer des prises de contact qualifiées.</w:t>
       </w:r>
     </w:p>
     <w:p>
@@ -501,7 +501,7 @@
           <w:sz w:val="21"/>
           <w:szCs w:val="21"/>
         </w:rPr>
-        <w:t xml:space="preserve">Permettre la navigation bilingue FR/EN et multi-devises</w:t>
+        <w:t xml:space="preserve">Permettre la navigation bilingue FR/EN et multi-devises (XOF/EUR/USD)</w:t>
       </w:r>
     </w:p>
     <w:p>
@@ -520,7 +520,45 @@
           <w:sz w:val="21"/>
           <w:szCs w:val="21"/>
         </w:rPr>
-        <w:t xml:space="preserve">Générer des commandes et demandes de contact directement depuis le site</w:t>
+        <w:t xml:space="preserve">Générer des commandes et devis directement depuis le site</w:t>
+      </w:r>
+    </w:p>
+    <w:p>
+      <w:pPr>
+        <w:pStyle w:val="ListParagraph"/>
+        <w:numPr>
+          <w:ilvl w:val="0"/>
+          <w:numId w:val="2"/>
+        </w:numPr>
+        <w:spacing w:after="50" w:before="40"/>
+      </w:pPr>
+      <w:r>
+        <w:rPr>
+          <w:rFonts w:ascii="Arial" w:cs="Arial" w:eastAsia="Arial" w:hAnsi="Arial"/>
+          <w:color w:val="1A1A1A"/>
+          <w:sz w:val="21"/>
+          <w:szCs w:val="21"/>
+        </w:rPr>
+        <w:t xml:space="preserve">Protéger l'historique des devis par accès administrateur sécurisé</w:t>
+      </w:r>
+    </w:p>
+    <w:p>
+      <w:pPr>
+        <w:pStyle w:val="ListParagraph"/>
+        <w:numPr>
+          <w:ilvl w:val="0"/>
+          <w:numId w:val="2"/>
+        </w:numPr>
+        <w:spacing w:after="50" w:before="40"/>
+      </w:pPr>
+      <w:r>
+        <w:rPr>
+          <w:rFonts w:ascii="Arial" w:cs="Arial" w:eastAsia="Arial" w:hAnsi="Arial"/>
+          <w:color w:val="1A1A1A"/>
+          <w:sz w:val="21"/>
+          <w:szCs w:val="21"/>
+        </w:rPr>
+        <w:t xml:space="preserve">Garantir la conformité légale internationale (RGPD, CCPA, Loi togolaise 2019-014)</w:t>
       </w:r>
     </w:p>
     <w:p>
@@ -551,6 +589,23 @@
         <w:t xml:space="preserve">2. Périmètre du projet</w:t>
       </w:r>
     </w:p>
+    <w:p>
+      <w:pPr>
+        <w:pStyle w:val="Heading2"/>
+        <w:spacing w:after="100" w:before="220"/>
+      </w:pPr>
+      <w:r>
+        <w:rPr>
+          <w:rFonts w:ascii="Arial" w:cs="Arial" w:eastAsia="Arial" w:hAnsi="Arial"/>
+          <w:b/>
+          <w:bCs/>
+          <w:color w:val="6B1A2B"/>
+          <w:sz w:val="24"/>
+          <w:szCs w:val="24"/>
+        </w:rPr>
+        <w:t xml:space="preserve">Pages principales (navigation publique)</w:t>
+      </w:r>
+    </w:p>
     <w:tbl>
       <w:tblPr>
         <w:tblW w:type="dxa" w:w="9026"/>
@@ -720,7 +775,7 @@
                 <w:sz w:val="20"/>
                 <w:szCs w:val="20"/>
               </w:rPr>
-              <w:t xml:space="preserve">Catalogue</w:t>
+              <w:t xml:space="preserve">Catalogue (catalogue.html)</w:t>
             </w:r>
           </w:p>
         </w:tc>
@@ -780,7 +835,7 @@
                 <w:sz w:val="20"/>
                 <w:szCs w:val="20"/>
               </w:rPr>
-              <w:t xml:space="preserve">À propos</w:t>
+              <w:t xml:space="preserve">À propos (about.html)</w:t>
             </w:r>
           </w:p>
         </w:tc>
@@ -840,7 +895,7 @@
                 <w:sz w:val="20"/>
                 <w:szCs w:val="20"/>
               </w:rPr>
-              <w:t xml:space="preserve">Blog</w:t>
+              <w:t xml:space="preserve">Blog (blog.html)</w:t>
             </w:r>
           </w:p>
         </w:tc>
@@ -900,7 +955,7 @@
                 <w:sz w:val="20"/>
                 <w:szCs w:val="20"/>
               </w:rPr>
-              <w:t xml:space="preserve">Contact</w:t>
+              <w:t xml:space="preserve">Contact (contact.html)</w:t>
             </w:r>
           </w:p>
         </w:tc>
@@ -929,7 +984,7 @@
                 <w:sz w:val="20"/>
                 <w:szCs w:val="20"/>
               </w:rPr>
-              <w:t xml:space="preserve">Formulaire + coordonnées</w:t>
+              <w:t xml:space="preserve">Formulaire + coordonnées + carte</w:t>
             </w:r>
           </w:p>
         </w:tc>
@@ -960,7 +1015,7 @@
                 <w:sz w:val="20"/>
                 <w:szCs w:val="20"/>
               </w:rPr>
-              <w:t xml:space="preserve">Commande</w:t>
+              <w:t xml:space="preserve">Commande (commande.html)</w:t>
             </w:r>
           </w:p>
         </w:tc>
@@ -989,7 +1044,416 @@
                 <w:sz w:val="20"/>
                 <w:szCs w:val="20"/>
               </w:rPr>
-              <w:t xml:space="preserve">Formulaire de commande produits</w:t>
+              <w:t xml:space="preserve">Formulaire de commande multi-produits</w:t>
+            </w:r>
+          </w:p>
+        </w:tc>
+      </w:tr>
+    </w:tbl>
+    <w:p>
+      <w:pPr>
+        <w:spacing w:after="120" w:before="0"/>
+      </w:pPr>
+      <w:r>
+        <w:t xml:space="preserve"/>
+      </w:r>
+    </w:p>
+    <w:p>
+      <w:pPr>
+        <w:pStyle w:val="Heading2"/>
+        <w:spacing w:after="100" w:before="220"/>
+      </w:pPr>
+      <w:r>
+        <w:rPr>
+          <w:rFonts w:ascii="Arial" w:cs="Arial" w:eastAsia="Arial" w:hAnsi="Arial"/>
+          <w:b/>
+          <w:bCs/>
+          <w:color w:val="6B1A2B"/>
+          <w:sz w:val="24"/>
+          <w:szCs w:val="24"/>
+        </w:rPr>
+        <w:t xml:space="preserve">Pages de support &amp; articles</w:t>
+      </w:r>
+    </w:p>
+    <w:tbl>
+      <w:tblPr>
+        <w:tblW w:type="dxa" w:w="9026"/>
+        <w:tblBorders>
+          <w:top w:val="single" w:color="auto" w:sz="4"/>
+          <w:left w:val="single" w:color="auto" w:sz="4"/>
+          <w:bottom w:val="single" w:color="auto" w:sz="4"/>
+          <w:right w:val="single" w:color="auto" w:sz="4"/>
+          <w:insideH w:val="single" w:color="auto" w:sz="4"/>
+          <w:insideV w:val="single" w:color="auto" w:sz="4"/>
+        </w:tblBorders>
+      </w:tblPr>
+      <w:tblGrid>
+        <w:gridCol w:w="2800"/>
+        <w:gridCol w:w="6226"/>
+      </w:tblGrid>
+      <w:tr>
+        <w:trPr>
+          <w:tblHeader/>
+        </w:trPr>
+        <w:tc>
+          <w:tcPr>
+            <w:tcW w:type="dxa" w:w="2800"/>
+            <w:tcBorders>
+              <w:top w:val="single" w:color="4D0F1C" w:sz="1"/>
+              <w:left w:val="single" w:color="4D0F1C" w:sz="1"/>
+              <w:bottom w:val="single" w:color="4D0F1C" w:sz="1"/>
+              <w:right w:val="single" w:color="4D0F1C" w:sz="1"/>
+            </w:tcBorders>
+            <w:shd w:fill="4D0F1C" w:val="clear"/>
+            <w:tcMar>
+              <w:top w:type="dxa" w:w="90"/>
+              <w:left w:type="dxa" w:w="130"/>
+              <w:bottom w:type="dxa" w:w="90"/>
+              <w:right w:type="dxa" w:w="130"/>
+            </w:tcMar>
+          </w:tcPr>
+          <w:p>
+            <w:r>
+              <w:rPr>
+                <w:rFonts w:ascii="Arial" w:cs="Arial" w:eastAsia="Arial" w:hAnsi="Arial"/>
+                <w:b/>
+                <w:bCs/>
+                <w:color w:val="FFFFFF"/>
+                <w:sz w:val="20"/>
+                <w:szCs w:val="20"/>
+              </w:rPr>
+              <w:t xml:space="preserve">Page</w:t>
+            </w:r>
+          </w:p>
+        </w:tc>
+        <w:tc>
+          <w:tcPr>
+            <w:tcW w:type="dxa" w:w="6226"/>
+            <w:tcBorders>
+              <w:top w:val="single" w:color="4D0F1C" w:sz="1"/>
+              <w:left w:val="single" w:color="4D0F1C" w:sz="1"/>
+              <w:bottom w:val="single" w:color="4D0F1C" w:sz="1"/>
+              <w:right w:val="single" w:color="4D0F1C" w:sz="1"/>
+            </w:tcBorders>
+            <w:shd w:fill="4D0F1C" w:val="clear"/>
+            <w:tcMar>
+              <w:top w:type="dxa" w:w="90"/>
+              <w:left w:type="dxa" w:w="130"/>
+              <w:bottom w:type="dxa" w:w="90"/>
+              <w:right w:type="dxa" w:w="130"/>
+            </w:tcMar>
+          </w:tcPr>
+          <w:p>
+            <w:r>
+              <w:rPr>
+                <w:rFonts w:ascii="Arial" w:cs="Arial" w:eastAsia="Arial" w:hAnsi="Arial"/>
+                <w:b/>
+                <w:bCs/>
+                <w:color w:val="FFFFFF"/>
+                <w:sz w:val="20"/>
+                <w:szCs w:val="20"/>
+              </w:rPr>
+              <w:t xml:space="preserve">Rôle</w:t>
+            </w:r>
+          </w:p>
+        </w:tc>
+      </w:tr>
+      <w:tr>
+        <w:tc>
+          <w:tcPr>
+            <w:tcW w:type="dxa" w:w="2800"/>
+            <w:tcBorders>
+              <w:top w:val="single" w:color="DDDDDD" w:sz="1"/>
+              <w:left w:val="single" w:color="DDDDDD" w:sz="1"/>
+              <w:bottom w:val="single" w:color="DDDDDD" w:sz="1"/>
+              <w:right w:val="single" w:color="DDDDDD" w:sz="1"/>
+            </w:tcBorders>
+            <w:shd w:fill="FFFFFF" w:val="clear"/>
+            <w:tcMar>
+              <w:top w:type="dxa" w:w="80"/>
+              <w:left w:type="dxa" w:w="130"/>
+              <w:bottom w:type="dxa" w:w="80"/>
+              <w:right w:type="dxa" w:w="130"/>
+            </w:tcMar>
+          </w:tcPr>
+          <w:p>
+            <w:r>
+              <w:rPr>
+                <w:rFonts w:ascii="Arial" w:cs="Arial" w:eastAsia="Arial" w:hAnsi="Arial"/>
+                <w:color w:val="1A1A1A"/>
+                <w:sz w:val="20"/>
+                <w:szCs w:val="20"/>
+              </w:rPr>
+              <w:t xml:space="preserve">devis.html</w:t>
+            </w:r>
+          </w:p>
+        </w:tc>
+        <w:tc>
+          <w:tcPr>
+            <w:tcW w:type="dxa" w:w="6226"/>
+            <w:tcBorders>
+              <w:top w:val="single" w:color="DDDDDD" w:sz="1"/>
+              <w:left w:val="single" w:color="DDDDDD" w:sz="1"/>
+              <w:bottom w:val="single" w:color="DDDDDD" w:sz="1"/>
+              <w:right w:val="single" w:color="DDDDDD" w:sz="1"/>
+            </w:tcBorders>
+            <w:shd w:fill="FFFFFF" w:val="clear"/>
+            <w:tcMar>
+              <w:top w:type="dxa" w:w="80"/>
+              <w:left w:type="dxa" w:w="130"/>
+              <w:bottom w:type="dxa" w:w="80"/>
+              <w:right w:type="dxa" w:w="130"/>
+            </w:tcMar>
+          </w:tcPr>
+          <w:p>
+            <w:r>
+              <w:rPr>
+                <w:rFonts w:ascii="Arial" w:cs="Arial" w:eastAsia="Arial" w:hAnsi="Arial"/>
+                <w:color w:val="1A1A1A"/>
+                <w:sz w:val="20"/>
+                <w:szCs w:val="20"/>
+              </w:rPr>
+              <w:t xml:space="preserve">Document devis PDF généré dynamiquement après commande</w:t>
+            </w:r>
+          </w:p>
+        </w:tc>
+      </w:tr>
+      <w:tr>
+        <w:tc>
+          <w:tcPr>
+            <w:tcW w:type="dxa" w:w="2800"/>
+            <w:tcBorders>
+              <w:top w:val="single" w:color="DDDDDD" w:sz="1"/>
+              <w:left w:val="single" w:color="DDDDDD" w:sz="1"/>
+              <w:bottom w:val="single" w:color="DDDDDD" w:sz="1"/>
+              <w:right w:val="single" w:color="DDDDDD" w:sz="1"/>
+            </w:tcBorders>
+            <w:shd w:fill="F7F3ED" w:val="clear"/>
+            <w:tcMar>
+              <w:top w:type="dxa" w:w="80"/>
+              <w:left w:type="dxa" w:w="130"/>
+              <w:bottom w:type="dxa" w:w="80"/>
+              <w:right w:type="dxa" w:w="130"/>
+            </w:tcMar>
+          </w:tcPr>
+          <w:p>
+            <w:r>
+              <w:rPr>
+                <w:rFonts w:ascii="Arial" w:cs="Arial" w:eastAsia="Arial" w:hAnsi="Arial"/>
+                <w:color w:val="1A1A1A"/>
+                <w:sz w:val="20"/>
+                <w:szCs w:val="20"/>
+              </w:rPr>
+              <w:t xml:space="preserve">historique.html</w:t>
+            </w:r>
+          </w:p>
+        </w:tc>
+        <w:tc>
+          <w:tcPr>
+            <w:tcW w:type="dxa" w:w="6226"/>
+            <w:tcBorders>
+              <w:top w:val="single" w:color="DDDDDD" w:sz="1"/>
+              <w:left w:val="single" w:color="DDDDDD" w:sz="1"/>
+              <w:bottom w:val="single" w:color="DDDDDD" w:sz="1"/>
+              <w:right w:val="single" w:color="DDDDDD" w:sz="1"/>
+            </w:tcBorders>
+            <w:shd w:fill="F7F3ED" w:val="clear"/>
+            <w:tcMar>
+              <w:top w:type="dxa" w:w="80"/>
+              <w:left w:type="dxa" w:w="130"/>
+              <w:bottom w:type="dxa" w:w="80"/>
+              <w:right w:type="dxa" w:w="130"/>
+            </w:tcMar>
+          </w:tcPr>
+          <w:p>
+            <w:r>
+              <w:rPr>
+                <w:rFonts w:ascii="Arial" w:cs="Arial" w:eastAsia="Arial" w:hAnsi="Arial"/>
+                <w:color w:val="1A1A1A"/>
+                <w:sz w:val="20"/>
+                <w:szCs w:val="20"/>
+              </w:rPr>
+              <w:t xml:space="preserve">Administration des devis — accès sécurisé par mot de passe</w:t>
+            </w:r>
+          </w:p>
+        </w:tc>
+      </w:tr>
+      <w:tr>
+        <w:tc>
+          <w:tcPr>
+            <w:tcW w:type="dxa" w:w="2800"/>
+            <w:tcBorders>
+              <w:top w:val="single" w:color="DDDDDD" w:sz="1"/>
+              <w:left w:val="single" w:color="DDDDDD" w:sz="1"/>
+              <w:bottom w:val="single" w:color="DDDDDD" w:sz="1"/>
+              <w:right w:val="single" w:color="DDDDDD" w:sz="1"/>
+            </w:tcBorders>
+            <w:shd w:fill="FFFFFF" w:val="clear"/>
+            <w:tcMar>
+              <w:top w:type="dxa" w:w="80"/>
+              <w:left w:type="dxa" w:w="130"/>
+              <w:bottom w:type="dxa" w:w="80"/>
+              <w:right w:type="dxa" w:w="130"/>
+            </w:tcMar>
+          </w:tcPr>
+          <w:p>
+            <w:r>
+              <w:rPr>
+                <w:rFonts w:ascii="Arial" w:cs="Arial" w:eastAsia="Arial" w:hAnsi="Arial"/>
+                <w:color w:val="1A1A1A"/>
+                <w:sz w:val="20"/>
+                <w:szCs w:val="20"/>
+              </w:rPr>
+              <w:t xml:space="preserve">confidentialite.html</w:t>
+            </w:r>
+          </w:p>
+        </w:tc>
+        <w:tc>
+          <w:tcPr>
+            <w:tcW w:type="dxa" w:w="6226"/>
+            <w:tcBorders>
+              <w:top w:val="single" w:color="DDDDDD" w:sz="1"/>
+              <w:left w:val="single" w:color="DDDDDD" w:sz="1"/>
+              <w:bottom w:val="single" w:color="DDDDDD" w:sz="1"/>
+              <w:right w:val="single" w:color="DDDDDD" w:sz="1"/>
+            </w:tcBorders>
+            <w:shd w:fill="FFFFFF" w:val="clear"/>
+            <w:tcMar>
+              <w:top w:type="dxa" w:w="80"/>
+              <w:left w:type="dxa" w:w="130"/>
+              <w:bottom w:type="dxa" w:w="80"/>
+              <w:right w:type="dxa" w:w="130"/>
+            </w:tcMar>
+          </w:tcPr>
+          <w:p>
+            <w:r>
+              <w:rPr>
+                <w:rFonts w:ascii="Arial" w:cs="Arial" w:eastAsia="Arial" w:hAnsi="Arial"/>
+                <w:color w:val="1A1A1A"/>
+                <w:sz w:val="20"/>
+                <w:szCs w:val="20"/>
+              </w:rPr>
+              <w:t xml:space="preserve">Politique de confidentialité internationale (RGPD, CCPA, Malabo)</w:t>
+            </w:r>
+          </w:p>
+        </w:tc>
+      </w:tr>
+      <w:tr>
+        <w:tc>
+          <w:tcPr>
+            <w:tcW w:type="dxa" w:w="2800"/>
+            <w:tcBorders>
+              <w:top w:val="single" w:color="DDDDDD" w:sz="1"/>
+              <w:left w:val="single" w:color="DDDDDD" w:sz="1"/>
+              <w:bottom w:val="single" w:color="DDDDDD" w:sz="1"/>
+              <w:right w:val="single" w:color="DDDDDD" w:sz="1"/>
+            </w:tcBorders>
+            <w:shd w:fill="F7F3ED" w:val="clear"/>
+            <w:tcMar>
+              <w:top w:type="dxa" w:w="80"/>
+              <w:left w:type="dxa" w:w="130"/>
+              <w:bottom w:type="dxa" w:w="80"/>
+              <w:right w:type="dxa" w:w="130"/>
+            </w:tcMar>
+          </w:tcPr>
+          <w:p>
+            <w:r>
+              <w:rPr>
+                <w:rFonts w:ascii="Arial" w:cs="Arial" w:eastAsia="Arial" w:hAnsi="Arial"/>
+                <w:color w:val="1A1A1A"/>
+                <w:sz w:val="20"/>
+                <w:szCs w:val="20"/>
+              </w:rPr>
+              <w:t xml:space="preserve">404.html</w:t>
+            </w:r>
+          </w:p>
+        </w:tc>
+        <w:tc>
+          <w:tcPr>
+            <w:tcW w:type="dxa" w:w="6226"/>
+            <w:tcBorders>
+              <w:top w:val="single" w:color="DDDDDD" w:sz="1"/>
+              <w:left w:val="single" w:color="DDDDDD" w:sz="1"/>
+              <w:bottom w:val="single" w:color="DDDDDD" w:sz="1"/>
+              <w:right w:val="single" w:color="DDDDDD" w:sz="1"/>
+            </w:tcBorders>
+            <w:shd w:fill="F7F3ED" w:val="clear"/>
+            <w:tcMar>
+              <w:top w:type="dxa" w:w="80"/>
+              <w:left w:type="dxa" w:w="130"/>
+              <w:bottom w:type="dxa" w:w="80"/>
+              <w:right w:type="dxa" w:w="130"/>
+            </w:tcMar>
+          </w:tcPr>
+          <w:p>
+            <w:r>
+              <w:rPr>
+                <w:rFonts w:ascii="Arial" w:cs="Arial" w:eastAsia="Arial" w:hAnsi="Arial"/>
+                <w:color w:val="1A1A1A"/>
+                <w:sz w:val="20"/>
+                <w:szCs w:val="20"/>
+              </w:rPr>
+              <w:t xml:space="preserve">Page d'erreur 404 personnalisée avec redirection</w:t>
+            </w:r>
+          </w:p>
+        </w:tc>
+      </w:tr>
+      <w:tr>
+        <w:tc>
+          <w:tcPr>
+            <w:tcW w:type="dxa" w:w="2800"/>
+            <w:tcBorders>
+              <w:top w:val="single" w:color="DDDDDD" w:sz="1"/>
+              <w:left w:val="single" w:color="DDDDDD" w:sz="1"/>
+              <w:bottom w:val="single" w:color="DDDDDD" w:sz="1"/>
+              <w:right w:val="single" w:color="DDDDDD" w:sz="1"/>
+            </w:tcBorders>
+            <w:shd w:fill="FFFFFF" w:val="clear"/>
+            <w:tcMar>
+              <w:top w:type="dxa" w:w="80"/>
+              <w:left w:type="dxa" w:w="130"/>
+              <w:bottom w:type="dxa" w:w="80"/>
+              <w:right w:type="dxa" w:w="130"/>
+            </w:tcMar>
+          </w:tcPr>
+          <w:p>
+            <w:r>
+              <w:rPr>
+                <w:rFonts w:ascii="Arial" w:cs="Arial" w:eastAsia="Arial" w:hAnsi="Arial"/>
+                <w:color w:val="1A1A1A"/>
+                <w:sz w:val="20"/>
+                <w:szCs w:val="20"/>
+              </w:rPr>
+              <w:t xml:space="preserve">6 pages articles blog</w:t>
+            </w:r>
+          </w:p>
+        </w:tc>
+        <w:tc>
+          <w:tcPr>
+            <w:tcW w:type="dxa" w:w="6226"/>
+            <w:tcBorders>
+              <w:top w:val="single" w:color="DDDDDD" w:sz="1"/>
+              <w:left w:val="single" w:color="DDDDDD" w:sz="1"/>
+              <w:bottom w:val="single" w:color="DDDDDD" w:sz="1"/>
+              <w:right w:val="single" w:color="DDDDDD" w:sz="1"/>
+            </w:tcBorders>
+            <w:shd w:fill="FFFFFF" w:val="clear"/>
+            <w:tcMar>
+              <w:top w:type="dxa" w:w="80"/>
+              <w:left w:type="dxa" w:w="130"/>
+              <w:bottom w:type="dxa" w:w="80"/>
+              <w:right w:type="dxa" w:w="130"/>
+            </w:tcMar>
+          </w:tcPr>
+          <w:p>
+            <w:r>
+              <w:rPr>
+                <w:rFonts w:ascii="Arial" w:cs="Arial" w:eastAsia="Arial" w:hAnsi="Arial"/>
+                <w:color w:val="1A1A1A"/>
+                <w:sz w:val="20"/>
+                <w:szCs w:val="20"/>
+              </w:rPr>
+              <w:t xml:space="preserve">bb-brasserie, bienfaits-vin-rouge, cocktails-maison, caves-lome, definition-vin, types-de-vins</w:t>
             </w:r>
           </w:p>
         </w:tc>
@@ -1129,7 +1593,7 @@
                 <w:sz w:val="20"/>
                 <w:szCs w:val="20"/>
               </w:rPr>
-              <w:t xml:space="preserve">Bilingue FR / EN dynamique</w:t>
+              <w:t xml:space="preserve">Bilingue FR / EN dynamique (sans rechargement)</w:t>
             </w:r>
           </w:p>
         </w:tc>
@@ -1158,7 +1622,7 @@
                 <w:sz w:val="20"/>
                 <w:szCs w:val="20"/>
               </w:rPr>
-              <w:t xml:space="preserve">Inclus</w:t>
+              <w:t xml:space="preserve">Livré</w:t>
             </w:r>
           </w:p>
         </w:tc>
@@ -1189,7 +1653,7 @@
                 <w:sz w:val="20"/>
                 <w:szCs w:val="20"/>
               </w:rPr>
-              <w:t xml:space="preserve">Convertisseur de devises (XOF / EUR / USD)</w:t>
+              <w:t xml:space="preserve">Convertisseur de devises XOF / EUR / USD</w:t>
             </w:r>
           </w:p>
         </w:tc>
@@ -1218,7 +1682,7 @@
                 <w:sz w:val="20"/>
                 <w:szCs w:val="20"/>
               </w:rPr>
-              <w:t xml:space="preserve">Inclus</w:t>
+              <w:t xml:space="preserve">Livré</w:t>
             </w:r>
           </w:p>
         </w:tc>
@@ -1249,7 +1713,7 @@
                 <w:sz w:val="20"/>
                 <w:szCs w:val="20"/>
               </w:rPr>
-              <w:t xml:space="preserve">Design 100% responsive (mobile, tablette, desktop)</w:t>
+              <w:t xml:space="preserve">Design responsive — 320px à 4K (5 breakpoints)</w:t>
             </w:r>
           </w:p>
         </w:tc>
@@ -1278,7 +1742,7 @@
                 <w:sz w:val="20"/>
                 <w:szCs w:val="20"/>
               </w:rPr>
-              <w:t xml:space="preserve">Inclus</w:t>
+              <w:t xml:space="preserve">Livré</w:t>
             </w:r>
           </w:p>
         </w:tc>
@@ -1309,7 +1773,7 @@
                 <w:sz w:val="20"/>
                 <w:szCs w:val="20"/>
               </w:rPr>
-              <w:t xml:space="preserve">Animations : parallaxe, carousel, compteurs</w:t>
+              <w:t xml:space="preserve">Optimisation cross-browser (Chrome, Firefox, Safari, Edge)</w:t>
             </w:r>
           </w:p>
         </w:tc>
@@ -1338,7 +1802,7 @@
                 <w:sz w:val="20"/>
                 <w:szCs w:val="20"/>
               </w:rPr>
-              <w:t xml:space="preserve">Inclus</w:t>
+              <w:t xml:space="preserve">Livré</w:t>
             </w:r>
           </w:p>
         </w:tc>
@@ -1369,7 +1833,7 @@
                 <w:sz w:val="20"/>
                 <w:szCs w:val="20"/>
               </w:rPr>
-              <w:t xml:space="preserve">Navigation sticky + hamburger mobile</w:t>
+              <w:t xml:space="preserve">Accessibilité : prefers-reduced-motion, focus-visible, ARIA</w:t>
             </w:r>
           </w:p>
         </w:tc>
@@ -1398,7 +1862,7 @@
                 <w:sz w:val="20"/>
                 <w:szCs w:val="20"/>
               </w:rPr>
-              <w:t xml:space="preserve">Inclus</w:t>
+              <w:t xml:space="preserve">Livré</w:t>
             </w:r>
           </w:p>
         </w:tc>
@@ -1429,7 +1893,7 @@
                 <w:sz w:val="20"/>
                 <w:szCs w:val="20"/>
               </w:rPr>
-              <w:t xml:space="preserve">Filtres catalogue + PDF téléchargeable</w:t>
+              <w:t xml:space="preserve">Cibles tactiles ≥ 44px — compatible touch / pointer: coarse</w:t>
             </w:r>
           </w:p>
         </w:tc>
@@ -1458,7 +1922,7 @@
                 <w:sz w:val="20"/>
                 <w:szCs w:val="20"/>
               </w:rPr>
-              <w:t xml:space="preserve">Inclus</w:t>
+              <w:t xml:space="preserve">Livré</w:t>
             </w:r>
           </w:p>
         </w:tc>
@@ -1489,7 +1953,7 @@
                 <w:sz w:val="20"/>
                 <w:szCs w:val="20"/>
               </w:rPr>
-              <w:t xml:space="preserve">Formulaires contact &amp; commande</w:t>
+              <w:t xml:space="preserve">Anti-zoom iOS — font-size ≥ 16px sur tous les inputs</w:t>
             </w:r>
           </w:p>
         </w:tc>
@@ -1518,7 +1982,7 @@
                 <w:sz w:val="20"/>
                 <w:szCs w:val="20"/>
               </w:rPr>
-              <w:t xml:space="preserve">Inclus</w:t>
+              <w:t xml:space="preserve">Livré</w:t>
             </w:r>
           </w:p>
         </w:tc>
@@ -1549,7 +2013,7 @@
                 <w:sz w:val="20"/>
                 <w:szCs w:val="20"/>
               </w:rPr>
-              <w:t xml:space="preserve">SEO de base (balises meta, titres, descriptions)</w:t>
+              <w:t xml:space="preserve">Génération de devis PDF dynamique (localStorage)</w:t>
             </w:r>
           </w:p>
         </w:tc>
@@ -1578,7 +2042,547 @@
                 <w:sz w:val="20"/>
                 <w:szCs w:val="20"/>
               </w:rPr>
-              <w:t xml:space="preserve">Inclus</w:t>
+              <w:t xml:space="preserve">Livré</w:t>
+            </w:r>
+          </w:p>
+        </w:tc>
+      </w:tr>
+      <w:tr>
+        <w:tc>
+          <w:tcPr>
+            <w:tcW w:type="dxa" w:w="5500"/>
+            <w:tcBorders>
+              <w:top w:val="single" w:color="DDDDDD" w:sz="1"/>
+              <w:left w:val="single" w:color="DDDDDD" w:sz="1"/>
+              <w:bottom w:val="single" w:color="DDDDDD" w:sz="1"/>
+              <w:right w:val="single" w:color="DDDDDD" w:sz="1"/>
+            </w:tcBorders>
+            <w:shd w:fill="FFFFFF" w:val="clear"/>
+            <w:tcMar>
+              <w:top w:type="dxa" w:w="80"/>
+              <w:left w:type="dxa" w:w="130"/>
+              <w:bottom w:type="dxa" w:w="80"/>
+              <w:right w:type="dxa" w:w="130"/>
+            </w:tcMar>
+          </w:tcPr>
+          <w:p>
+            <w:r>
+              <w:rPr>
+                <w:rFonts w:ascii="Arial" w:cs="Arial" w:eastAsia="Arial" w:hAnsi="Arial"/>
+                <w:color w:val="1A1A1A"/>
+                <w:sz w:val="20"/>
+                <w:szCs w:val="20"/>
+              </w:rPr>
+              <w:t xml:space="preserve">Historique admin sécurisé par mot de passe (overlay login)</w:t>
+            </w:r>
+          </w:p>
+        </w:tc>
+        <w:tc>
+          <w:tcPr>
+            <w:tcW w:type="dxa" w:w="3526"/>
+            <w:tcBorders>
+              <w:top w:val="single" w:color="DDDDDD" w:sz="1"/>
+              <w:left w:val="single" w:color="DDDDDD" w:sz="1"/>
+              <w:bottom w:val="single" w:color="DDDDDD" w:sz="1"/>
+              <w:right w:val="single" w:color="DDDDDD" w:sz="1"/>
+            </w:tcBorders>
+            <w:shd w:fill="FFFFFF" w:val="clear"/>
+            <w:tcMar>
+              <w:top w:type="dxa" w:w="80"/>
+              <w:left w:type="dxa" w:w="130"/>
+              <w:bottom w:type="dxa" w:w="80"/>
+              <w:right w:type="dxa" w:w="130"/>
+            </w:tcMar>
+          </w:tcPr>
+          <w:p>
+            <w:r>
+              <w:rPr>
+                <w:rFonts w:ascii="Arial" w:cs="Arial" w:eastAsia="Arial" w:hAnsi="Arial"/>
+                <w:color w:val="1A1A1A"/>
+                <w:sz w:val="20"/>
+                <w:szCs w:val="20"/>
+              </w:rPr>
+              <w:t xml:space="preserve">Livré</w:t>
+            </w:r>
+          </w:p>
+        </w:tc>
+      </w:tr>
+      <w:tr>
+        <w:tc>
+          <w:tcPr>
+            <w:tcW w:type="dxa" w:w="5500"/>
+            <w:tcBorders>
+              <w:top w:val="single" w:color="DDDDDD" w:sz="1"/>
+              <w:left w:val="single" w:color="DDDDDD" w:sz="1"/>
+              <w:bottom w:val="single" w:color="DDDDDD" w:sz="1"/>
+              <w:right w:val="single" w:color="DDDDDD" w:sz="1"/>
+            </w:tcBorders>
+            <w:shd w:fill="F7F3ED" w:val="clear"/>
+            <w:tcMar>
+              <w:top w:type="dxa" w:w="80"/>
+              <w:left w:type="dxa" w:w="130"/>
+              <w:bottom w:type="dxa" w:w="80"/>
+              <w:right w:type="dxa" w:w="130"/>
+            </w:tcMar>
+          </w:tcPr>
+          <w:p>
+            <w:r>
+              <w:rPr>
+                <w:rFonts w:ascii="Arial" w:cs="Arial" w:eastAsia="Arial" w:hAnsi="Arial"/>
+                <w:color w:val="1A1A1A"/>
+                <w:sz w:val="20"/>
+                <w:szCs w:val="20"/>
+              </w:rPr>
+              <w:t xml:space="preserve">Politique de confidentialité internationale (13 articles)</w:t>
+            </w:r>
+          </w:p>
+        </w:tc>
+        <w:tc>
+          <w:tcPr>
+            <w:tcW w:type="dxa" w:w="3526"/>
+            <w:tcBorders>
+              <w:top w:val="single" w:color="DDDDDD" w:sz="1"/>
+              <w:left w:val="single" w:color="DDDDDD" w:sz="1"/>
+              <w:bottom w:val="single" w:color="DDDDDD" w:sz="1"/>
+              <w:right w:val="single" w:color="DDDDDD" w:sz="1"/>
+            </w:tcBorders>
+            <w:shd w:fill="F7F3ED" w:val="clear"/>
+            <w:tcMar>
+              <w:top w:type="dxa" w:w="80"/>
+              <w:left w:type="dxa" w:w="130"/>
+              <w:bottom w:type="dxa" w:w="80"/>
+              <w:right w:type="dxa" w:w="130"/>
+            </w:tcMar>
+          </w:tcPr>
+          <w:p>
+            <w:r>
+              <w:rPr>
+                <w:rFonts w:ascii="Arial" w:cs="Arial" w:eastAsia="Arial" w:hAnsi="Arial"/>
+                <w:color w:val="1A1A1A"/>
+                <w:sz w:val="20"/>
+                <w:szCs w:val="20"/>
+              </w:rPr>
+              <w:t xml:space="preserve">Livré</w:t>
+            </w:r>
+          </w:p>
+        </w:tc>
+      </w:tr>
+      <w:tr>
+        <w:tc>
+          <w:tcPr>
+            <w:tcW w:type="dxa" w:w="5500"/>
+            <w:tcBorders>
+              <w:top w:val="single" w:color="DDDDDD" w:sz="1"/>
+              <w:left w:val="single" w:color="DDDDDD" w:sz="1"/>
+              <w:bottom w:val="single" w:color="DDDDDD" w:sz="1"/>
+              <w:right w:val="single" w:color="DDDDDD" w:sz="1"/>
+            </w:tcBorders>
+            <w:shd w:fill="FFFFFF" w:val="clear"/>
+            <w:tcMar>
+              <w:top w:type="dxa" w:w="80"/>
+              <w:left w:type="dxa" w:w="130"/>
+              <w:bottom w:type="dxa" w:w="80"/>
+              <w:right w:type="dxa" w:w="130"/>
+            </w:tcMar>
+          </w:tcPr>
+          <w:p>
+            <w:r>
+              <w:rPr>
+                <w:rFonts w:ascii="Arial" w:cs="Arial" w:eastAsia="Arial" w:hAnsi="Arial"/>
+                <w:color w:val="1A1A1A"/>
+                <w:sz w:val="20"/>
+                <w:szCs w:val="20"/>
+              </w:rPr>
+              <w:t xml:space="preserve">Navigation sticky + hamburger mobile animé</w:t>
+            </w:r>
+          </w:p>
+        </w:tc>
+        <w:tc>
+          <w:tcPr>
+            <w:tcW w:type="dxa" w:w="3526"/>
+            <w:tcBorders>
+              <w:top w:val="single" w:color="DDDDDD" w:sz="1"/>
+              <w:left w:val="single" w:color="DDDDDD" w:sz="1"/>
+              <w:bottom w:val="single" w:color="DDDDDD" w:sz="1"/>
+              <w:right w:val="single" w:color="DDDDDD" w:sz="1"/>
+            </w:tcBorders>
+            <w:shd w:fill="FFFFFF" w:val="clear"/>
+            <w:tcMar>
+              <w:top w:type="dxa" w:w="80"/>
+              <w:left w:type="dxa" w:w="130"/>
+              <w:bottom w:type="dxa" w:w="80"/>
+              <w:right w:type="dxa" w:w="130"/>
+            </w:tcMar>
+          </w:tcPr>
+          <w:p>
+            <w:r>
+              <w:rPr>
+                <w:rFonts w:ascii="Arial" w:cs="Arial" w:eastAsia="Arial" w:hAnsi="Arial"/>
+                <w:color w:val="1A1A1A"/>
+                <w:sz w:val="20"/>
+                <w:szCs w:val="20"/>
+              </w:rPr>
+              <w:t xml:space="preserve">Livré</w:t>
+            </w:r>
+          </w:p>
+        </w:tc>
+      </w:tr>
+      <w:tr>
+        <w:tc>
+          <w:tcPr>
+            <w:tcW w:type="dxa" w:w="5500"/>
+            <w:tcBorders>
+              <w:top w:val="single" w:color="DDDDDD" w:sz="1"/>
+              <w:left w:val="single" w:color="DDDDDD" w:sz="1"/>
+              <w:bottom w:val="single" w:color="DDDDDD" w:sz="1"/>
+              <w:right w:val="single" w:color="DDDDDD" w:sz="1"/>
+            </w:tcBorders>
+            <w:shd w:fill="F7F3ED" w:val="clear"/>
+            <w:tcMar>
+              <w:top w:type="dxa" w:w="80"/>
+              <w:left w:type="dxa" w:w="130"/>
+              <w:bottom w:type="dxa" w:w="80"/>
+              <w:right w:type="dxa" w:w="130"/>
+            </w:tcMar>
+          </w:tcPr>
+          <w:p>
+            <w:r>
+              <w:rPr>
+                <w:rFonts w:ascii="Arial" w:cs="Arial" w:eastAsia="Arial" w:hAnsi="Arial"/>
+                <w:color w:val="1A1A1A"/>
+                <w:sz w:val="20"/>
+                <w:szCs w:val="20"/>
+              </w:rPr>
+              <w:t xml:space="preserve">Filtres catalogue + téléchargement PDF</w:t>
+            </w:r>
+          </w:p>
+        </w:tc>
+        <w:tc>
+          <w:tcPr>
+            <w:tcW w:type="dxa" w:w="3526"/>
+            <w:tcBorders>
+              <w:top w:val="single" w:color="DDDDDD" w:sz="1"/>
+              <w:left w:val="single" w:color="DDDDDD" w:sz="1"/>
+              <w:bottom w:val="single" w:color="DDDDDD" w:sz="1"/>
+              <w:right w:val="single" w:color="DDDDDD" w:sz="1"/>
+            </w:tcBorders>
+            <w:shd w:fill="F7F3ED" w:val="clear"/>
+            <w:tcMar>
+              <w:top w:type="dxa" w:w="80"/>
+              <w:left w:type="dxa" w:w="130"/>
+              <w:bottom w:type="dxa" w:w="80"/>
+              <w:right w:type="dxa" w:w="130"/>
+            </w:tcMar>
+          </w:tcPr>
+          <w:p>
+            <w:r>
+              <w:rPr>
+                <w:rFonts w:ascii="Arial" w:cs="Arial" w:eastAsia="Arial" w:hAnsi="Arial"/>
+                <w:color w:val="1A1A1A"/>
+                <w:sz w:val="20"/>
+                <w:szCs w:val="20"/>
+              </w:rPr>
+              <w:t xml:space="preserve">Livré</w:t>
+            </w:r>
+          </w:p>
+        </w:tc>
+      </w:tr>
+      <w:tr>
+        <w:tc>
+          <w:tcPr>
+            <w:tcW w:type="dxa" w:w="5500"/>
+            <w:tcBorders>
+              <w:top w:val="single" w:color="DDDDDD" w:sz="1"/>
+              <w:left w:val="single" w:color="DDDDDD" w:sz="1"/>
+              <w:bottom w:val="single" w:color="DDDDDD" w:sz="1"/>
+              <w:right w:val="single" w:color="DDDDDD" w:sz="1"/>
+            </w:tcBorders>
+            <w:shd w:fill="FFFFFF" w:val="clear"/>
+            <w:tcMar>
+              <w:top w:type="dxa" w:w="80"/>
+              <w:left w:type="dxa" w:w="130"/>
+              <w:bottom w:type="dxa" w:w="80"/>
+              <w:right w:type="dxa" w:w="130"/>
+            </w:tcMar>
+          </w:tcPr>
+          <w:p>
+            <w:r>
+              <w:rPr>
+                <w:rFonts w:ascii="Arial" w:cs="Arial" w:eastAsia="Arial" w:hAnsi="Arial"/>
+                <w:color w:val="1A1A1A"/>
+                <w:sz w:val="20"/>
+                <w:szCs w:val="20"/>
+              </w:rPr>
+              <w:t xml:space="preserve">Formulaires contact &amp; commande avec validation</w:t>
+            </w:r>
+          </w:p>
+        </w:tc>
+        <w:tc>
+          <w:tcPr>
+            <w:tcW w:type="dxa" w:w="3526"/>
+            <w:tcBorders>
+              <w:top w:val="single" w:color="DDDDDD" w:sz="1"/>
+              <w:left w:val="single" w:color="DDDDDD" w:sz="1"/>
+              <w:bottom w:val="single" w:color="DDDDDD" w:sz="1"/>
+              <w:right w:val="single" w:color="DDDDDD" w:sz="1"/>
+            </w:tcBorders>
+            <w:shd w:fill="FFFFFF" w:val="clear"/>
+            <w:tcMar>
+              <w:top w:type="dxa" w:w="80"/>
+              <w:left w:type="dxa" w:w="130"/>
+              <w:bottom w:type="dxa" w:w="80"/>
+              <w:right w:type="dxa" w:w="130"/>
+            </w:tcMar>
+          </w:tcPr>
+          <w:p>
+            <w:r>
+              <w:rPr>
+                <w:rFonts w:ascii="Arial" w:cs="Arial" w:eastAsia="Arial" w:hAnsi="Arial"/>
+                <w:color w:val="1A1A1A"/>
+                <w:sz w:val="20"/>
+                <w:szCs w:val="20"/>
+              </w:rPr>
+              <w:t xml:space="preserve">Livré</w:t>
+            </w:r>
+          </w:p>
+        </w:tc>
+      </w:tr>
+      <w:tr>
+        <w:tc>
+          <w:tcPr>
+            <w:tcW w:type="dxa" w:w="5500"/>
+            <w:tcBorders>
+              <w:top w:val="single" w:color="DDDDDD" w:sz="1"/>
+              <w:left w:val="single" w:color="DDDDDD" w:sz="1"/>
+              <w:bottom w:val="single" w:color="DDDDDD" w:sz="1"/>
+              <w:right w:val="single" w:color="DDDDDD" w:sz="1"/>
+            </w:tcBorders>
+            <w:shd w:fill="F7F3ED" w:val="clear"/>
+            <w:tcMar>
+              <w:top w:type="dxa" w:w="80"/>
+              <w:left w:type="dxa" w:w="130"/>
+              <w:bottom w:type="dxa" w:w="80"/>
+              <w:right w:type="dxa" w:w="130"/>
+            </w:tcMar>
+          </w:tcPr>
+          <w:p>
+            <w:r>
+              <w:rPr>
+                <w:rFonts w:ascii="Arial" w:cs="Arial" w:eastAsia="Arial" w:hAnsi="Arial"/>
+                <w:color w:val="1A1A1A"/>
+                <w:sz w:val="20"/>
+                <w:szCs w:val="20"/>
+              </w:rPr>
+              <w:t xml:space="preserve">WhatsApp FAB + partage devis sur WhatsApp</w:t>
+            </w:r>
+          </w:p>
+        </w:tc>
+        <w:tc>
+          <w:tcPr>
+            <w:tcW w:type="dxa" w:w="3526"/>
+            <w:tcBorders>
+              <w:top w:val="single" w:color="DDDDDD" w:sz="1"/>
+              <w:left w:val="single" w:color="DDDDDD" w:sz="1"/>
+              <w:bottom w:val="single" w:color="DDDDDD" w:sz="1"/>
+              <w:right w:val="single" w:color="DDDDDD" w:sz="1"/>
+            </w:tcBorders>
+            <w:shd w:fill="F7F3ED" w:val="clear"/>
+            <w:tcMar>
+              <w:top w:type="dxa" w:w="80"/>
+              <w:left w:type="dxa" w:w="130"/>
+              <w:bottom w:type="dxa" w:w="80"/>
+              <w:right w:type="dxa" w:w="130"/>
+            </w:tcMar>
+          </w:tcPr>
+          <w:p>
+            <w:r>
+              <w:rPr>
+                <w:rFonts w:ascii="Arial" w:cs="Arial" w:eastAsia="Arial" w:hAnsi="Arial"/>
+                <w:color w:val="1A1A1A"/>
+                <w:sz w:val="20"/>
+                <w:szCs w:val="20"/>
+              </w:rPr>
+              <w:t xml:space="preserve">Livré</w:t>
+            </w:r>
+          </w:p>
+        </w:tc>
+      </w:tr>
+      <w:tr>
+        <w:tc>
+          <w:tcPr>
+            <w:tcW w:type="dxa" w:w="5500"/>
+            <w:tcBorders>
+              <w:top w:val="single" w:color="DDDDDD" w:sz="1"/>
+              <w:left w:val="single" w:color="DDDDDD" w:sz="1"/>
+              <w:bottom w:val="single" w:color="DDDDDD" w:sz="1"/>
+              <w:right w:val="single" w:color="DDDDDD" w:sz="1"/>
+            </w:tcBorders>
+            <w:shd w:fill="FFFFFF" w:val="clear"/>
+            <w:tcMar>
+              <w:top w:type="dxa" w:w="80"/>
+              <w:left w:type="dxa" w:w="130"/>
+              <w:bottom w:type="dxa" w:w="80"/>
+              <w:right w:type="dxa" w:w="130"/>
+            </w:tcMar>
+          </w:tcPr>
+          <w:p>
+            <w:r>
+              <w:rPr>
+                <w:rFonts w:ascii="Arial" w:cs="Arial" w:eastAsia="Arial" w:hAnsi="Arial"/>
+                <w:color w:val="1A1A1A"/>
+                <w:sz w:val="20"/>
+                <w:szCs w:val="20"/>
+              </w:rPr>
+              <w:t xml:space="preserve">SEO : meta, Open Graph, sitemap.xml, robots.txt</w:t>
+            </w:r>
+          </w:p>
+        </w:tc>
+        <w:tc>
+          <w:tcPr>
+            <w:tcW w:type="dxa" w:w="3526"/>
+            <w:tcBorders>
+              <w:top w:val="single" w:color="DDDDDD" w:sz="1"/>
+              <w:left w:val="single" w:color="DDDDDD" w:sz="1"/>
+              <w:bottom w:val="single" w:color="DDDDDD" w:sz="1"/>
+              <w:right w:val="single" w:color="DDDDDD" w:sz="1"/>
+            </w:tcBorders>
+            <w:shd w:fill="FFFFFF" w:val="clear"/>
+            <w:tcMar>
+              <w:top w:type="dxa" w:w="80"/>
+              <w:left w:type="dxa" w:w="130"/>
+              <w:bottom w:type="dxa" w:w="80"/>
+              <w:right w:type="dxa" w:w="130"/>
+            </w:tcMar>
+          </w:tcPr>
+          <w:p>
+            <w:r>
+              <w:rPr>
+                <w:rFonts w:ascii="Arial" w:cs="Arial" w:eastAsia="Arial" w:hAnsi="Arial"/>
+                <w:color w:val="1A1A1A"/>
+                <w:sz w:val="20"/>
+                <w:szCs w:val="20"/>
+              </w:rPr>
+              <w:t xml:space="preserve">Livré</w:t>
+            </w:r>
+          </w:p>
+        </w:tc>
+      </w:tr>
+      <w:tr>
+        <w:tc>
+          <w:tcPr>
+            <w:tcW w:type="dxa" w:w="5500"/>
+            <w:tcBorders>
+              <w:top w:val="single" w:color="DDDDDD" w:sz="1"/>
+              <w:left w:val="single" w:color="DDDDDD" w:sz="1"/>
+              <w:bottom w:val="single" w:color="DDDDDD" w:sz="1"/>
+              <w:right w:val="single" w:color="DDDDDD" w:sz="1"/>
+            </w:tcBorders>
+            <w:shd w:fill="F7F3ED" w:val="clear"/>
+            <w:tcMar>
+              <w:top w:type="dxa" w:w="80"/>
+              <w:left w:type="dxa" w:w="130"/>
+              <w:bottom w:type="dxa" w:w="80"/>
+              <w:right w:type="dxa" w:w="130"/>
+            </w:tcMar>
+          </w:tcPr>
+          <w:p>
+            <w:r>
+              <w:rPr>
+                <w:rFonts w:ascii="Arial" w:cs="Arial" w:eastAsia="Arial" w:hAnsi="Arial"/>
+                <w:color w:val="1A1A1A"/>
+                <w:sz w:val="20"/>
+                <w:szCs w:val="20"/>
+              </w:rPr>
+              <w:t xml:space="preserve">Séparation totale HTML / CSS (aucun style inline dans &lt;head&gt;)</w:t>
+            </w:r>
+          </w:p>
+        </w:tc>
+        <w:tc>
+          <w:tcPr>
+            <w:tcW w:type="dxa" w:w="3526"/>
+            <w:tcBorders>
+              <w:top w:val="single" w:color="DDDDDD" w:sz="1"/>
+              <w:left w:val="single" w:color="DDDDDD" w:sz="1"/>
+              <w:bottom w:val="single" w:color="DDDDDD" w:sz="1"/>
+              <w:right w:val="single" w:color="DDDDDD" w:sz="1"/>
+            </w:tcBorders>
+            <w:shd w:fill="F7F3ED" w:val="clear"/>
+            <w:tcMar>
+              <w:top w:type="dxa" w:w="80"/>
+              <w:left w:type="dxa" w:w="130"/>
+              <w:bottom w:type="dxa" w:w="80"/>
+              <w:right w:type="dxa" w:w="130"/>
+            </w:tcMar>
+          </w:tcPr>
+          <w:p>
+            <w:r>
+              <w:rPr>
+                <w:rFonts w:ascii="Arial" w:cs="Arial" w:eastAsia="Arial" w:hAnsi="Arial"/>
+                <w:color w:val="1A1A1A"/>
+                <w:sz w:val="20"/>
+                <w:szCs w:val="20"/>
+              </w:rPr>
+              <w:t xml:space="preserve">Livré</w:t>
+            </w:r>
+          </w:p>
+        </w:tc>
+      </w:tr>
+      <w:tr>
+        <w:tc>
+          <w:tcPr>
+            <w:tcW w:type="dxa" w:w="5500"/>
+            <w:tcBorders>
+              <w:top w:val="single" w:color="DDDDDD" w:sz="1"/>
+              <w:left w:val="single" w:color="DDDDDD" w:sz="1"/>
+              <w:bottom w:val="single" w:color="DDDDDD" w:sz="1"/>
+              <w:right w:val="single" w:color="DDDDDD" w:sz="1"/>
+            </w:tcBorders>
+            <w:shd w:fill="FFFFFF" w:val="clear"/>
+            <w:tcMar>
+              <w:top w:type="dxa" w:w="80"/>
+              <w:left w:type="dxa" w:w="130"/>
+              <w:bottom w:type="dxa" w:w="80"/>
+              <w:right w:type="dxa" w:w="130"/>
+            </w:tcMar>
+          </w:tcPr>
+          <w:p>
+            <w:r>
+              <w:rPr>
+                <w:rFonts w:ascii="Arial" w:cs="Arial" w:eastAsia="Arial" w:hAnsi="Arial"/>
+                <w:color w:val="1A1A1A"/>
+                <w:sz w:val="20"/>
+                <w:szCs w:val="20"/>
+              </w:rPr>
+              <w:t xml:space="preserve">Page 404 personnalisée aux couleurs de la marque</w:t>
+            </w:r>
+          </w:p>
+        </w:tc>
+        <w:tc>
+          <w:tcPr>
+            <w:tcW w:type="dxa" w:w="3526"/>
+            <w:tcBorders>
+              <w:top w:val="single" w:color="DDDDDD" w:sz="1"/>
+              <w:left w:val="single" w:color="DDDDDD" w:sz="1"/>
+              <w:bottom w:val="single" w:color="DDDDDD" w:sz="1"/>
+              <w:right w:val="single" w:color="DDDDDD" w:sz="1"/>
+            </w:tcBorders>
+            <w:shd w:fill="FFFFFF" w:val="clear"/>
+            <w:tcMar>
+              <w:top w:type="dxa" w:w="80"/>
+              <w:left w:type="dxa" w:w="130"/>
+              <w:bottom w:type="dxa" w:w="80"/>
+              <w:right w:type="dxa" w:w="130"/>
+            </w:tcMar>
+          </w:tcPr>
+          <w:p>
+            <w:r>
+              <w:rPr>
+                <w:rFonts w:ascii="Arial" w:cs="Arial" w:eastAsia="Arial" w:hAnsi="Arial"/>
+                <w:color w:val="1A1A1A"/>
+                <w:sz w:val="20"/>
+                <w:szCs w:val="20"/>
+              </w:rPr>
+              <w:t xml:space="preserve">Livré</w:t>
             </w:r>
           </w:p>
         </w:tc>
@@ -1612,18 +2616,662 @@
         <w:t xml:space="preserve">3. Aspects techniques</w:t>
       </w:r>
     </w:p>
+    <w:tbl>
+      <w:tblPr>
+        <w:tblW w:type="dxa" w:w="9026"/>
+        <w:tblBorders>
+          <w:top w:val="single" w:color="auto" w:sz="4"/>
+          <w:left w:val="single" w:color="auto" w:sz="4"/>
+          <w:bottom w:val="single" w:color="auto" w:sz="4"/>
+          <w:right w:val="single" w:color="auto" w:sz="4"/>
+          <w:insideH w:val="single" w:color="auto" w:sz="4"/>
+          <w:insideV w:val="single" w:color="auto" w:sz="4"/>
+        </w:tblBorders>
+      </w:tblPr>
+      <w:tblGrid>
+        <w:gridCol w:w="2800"/>
+        <w:gridCol w:w="4400"/>
+        <w:gridCol w:w="1826"/>
+      </w:tblGrid>
+      <w:tr>
+        <w:trPr>
+          <w:tblHeader/>
+        </w:trPr>
+        <w:tc>
+          <w:tcPr>
+            <w:tcW w:type="dxa" w:w="2800"/>
+            <w:tcBorders>
+              <w:top w:val="single" w:color="4D0F1C" w:sz="1"/>
+              <w:left w:val="single" w:color="4D0F1C" w:sz="1"/>
+              <w:bottom w:val="single" w:color="4D0F1C" w:sz="1"/>
+              <w:right w:val="single" w:color="4D0F1C" w:sz="1"/>
+            </w:tcBorders>
+            <w:shd w:fill="4D0F1C" w:val="clear"/>
+            <w:tcMar>
+              <w:top w:type="dxa" w:w="90"/>
+              <w:left w:type="dxa" w:w="130"/>
+              <w:bottom w:type="dxa" w:w="90"/>
+              <w:right w:type="dxa" w:w="130"/>
+            </w:tcMar>
+          </w:tcPr>
+          <w:p>
+            <w:r>
+              <w:rPr>
+                <w:rFonts w:ascii="Arial" w:cs="Arial" w:eastAsia="Arial" w:hAnsi="Arial"/>
+                <w:b/>
+                <w:bCs/>
+                <w:color w:val="FFFFFF"/>
+                <w:sz w:val="20"/>
+                <w:szCs w:val="20"/>
+              </w:rPr>
+              <w:t xml:space="preserve">Fichier</w:t>
+            </w:r>
+          </w:p>
+        </w:tc>
+        <w:tc>
+          <w:tcPr>
+            <w:tcW w:type="dxa" w:w="4400"/>
+            <w:tcBorders>
+              <w:top w:val="single" w:color="4D0F1C" w:sz="1"/>
+              <w:left w:val="single" w:color="4D0F1C" w:sz="1"/>
+              <w:bottom w:val="single" w:color="4D0F1C" w:sz="1"/>
+              <w:right w:val="single" w:color="4D0F1C" w:sz="1"/>
+            </w:tcBorders>
+            <w:shd w:fill="4D0F1C" w:val="clear"/>
+            <w:tcMar>
+              <w:top w:type="dxa" w:w="90"/>
+              <w:left w:type="dxa" w:w="130"/>
+              <w:bottom w:type="dxa" w:w="90"/>
+              <w:right w:type="dxa" w:w="130"/>
+            </w:tcMar>
+          </w:tcPr>
+          <w:p>
+            <w:r>
+              <w:rPr>
+                <w:rFonts w:ascii="Arial" w:cs="Arial" w:eastAsia="Arial" w:hAnsi="Arial"/>
+                <w:b/>
+                <w:bCs/>
+                <w:color w:val="FFFFFF"/>
+                <w:sz w:val="20"/>
+                <w:szCs w:val="20"/>
+              </w:rPr>
+              <w:t xml:space="preserve">Rôle</w:t>
+            </w:r>
+          </w:p>
+        </w:tc>
+        <w:tc>
+          <w:tcPr>
+            <w:tcW w:type="dxa" w:w="1826"/>
+            <w:tcBorders>
+              <w:top w:val="single" w:color="4D0F1C" w:sz="1"/>
+              <w:left w:val="single" w:color="4D0F1C" w:sz="1"/>
+              <w:bottom w:val="single" w:color="4D0F1C" w:sz="1"/>
+              <w:right w:val="single" w:color="4D0F1C" w:sz="1"/>
+            </w:tcBorders>
+            <w:shd w:fill="4D0F1C" w:val="clear"/>
+            <w:tcMar>
+              <w:top w:type="dxa" w:w="90"/>
+              <w:left w:type="dxa" w:w="130"/>
+              <w:bottom w:type="dxa" w:w="90"/>
+              <w:right w:type="dxa" w:w="130"/>
+            </w:tcMar>
+          </w:tcPr>
+          <w:p>
+            <w:r>
+              <w:rPr>
+                <w:rFonts w:ascii="Arial" w:cs="Arial" w:eastAsia="Arial" w:hAnsi="Arial"/>
+                <w:b/>
+                <w:bCs/>
+                <w:color w:val="FFFFFF"/>
+                <w:sz w:val="20"/>
+                <w:szCs w:val="20"/>
+              </w:rPr>
+              <w:t xml:space="preserve">Lignes</w:t>
+            </w:r>
+          </w:p>
+        </w:tc>
+      </w:tr>
+      <w:tr>
+        <w:tc>
+          <w:tcPr>
+            <w:tcW w:type="dxa" w:w="2800"/>
+            <w:tcBorders>
+              <w:top w:val="single" w:color="DDDDDD" w:sz="1"/>
+              <w:left w:val="single" w:color="DDDDDD" w:sz="1"/>
+              <w:bottom w:val="single" w:color="DDDDDD" w:sz="1"/>
+              <w:right w:val="single" w:color="DDDDDD" w:sz="1"/>
+            </w:tcBorders>
+            <w:shd w:fill="FFFFFF" w:val="clear"/>
+            <w:tcMar>
+              <w:top w:type="dxa" w:w="80"/>
+              <w:left w:type="dxa" w:w="130"/>
+              <w:bottom w:type="dxa" w:w="80"/>
+              <w:right w:type="dxa" w:w="130"/>
+            </w:tcMar>
+          </w:tcPr>
+          <w:p>
+            <w:r>
+              <w:rPr>
+                <w:rFonts w:ascii="Arial" w:cs="Arial" w:eastAsia="Arial" w:hAnsi="Arial"/>
+                <w:color w:val="1A1A1A"/>
+                <w:sz w:val="20"/>
+                <w:szCs w:val="20"/>
+              </w:rPr>
+              <w:t xml:space="preserve">style.css</w:t>
+            </w:r>
+          </w:p>
+        </w:tc>
+        <w:tc>
+          <w:tcPr>
+            <w:tcW w:type="dxa" w:w="4400"/>
+            <w:tcBorders>
+              <w:top w:val="single" w:color="DDDDDD" w:sz="1"/>
+              <w:left w:val="single" w:color="DDDDDD" w:sz="1"/>
+              <w:bottom w:val="single" w:color="DDDDDD" w:sz="1"/>
+              <w:right w:val="single" w:color="DDDDDD" w:sz="1"/>
+            </w:tcBorders>
+            <w:shd w:fill="FFFFFF" w:val="clear"/>
+            <w:tcMar>
+              <w:top w:type="dxa" w:w="80"/>
+              <w:left w:type="dxa" w:w="130"/>
+              <w:bottom w:type="dxa" w:w="80"/>
+              <w:right w:type="dxa" w:w="130"/>
+            </w:tcMar>
+          </w:tcPr>
+          <w:p>
+            <w:r>
+              <w:rPr>
+                <w:rFonts w:ascii="Arial" w:cs="Arial" w:eastAsia="Arial" w:hAnsi="Arial"/>
+                <w:color w:val="1A1A1A"/>
+                <w:sz w:val="20"/>
+                <w:szCs w:val="20"/>
+              </w:rPr>
+              <w:t xml:space="preserve">Feuille de styles globale — responsive, animations, admin</w:t>
+            </w:r>
+          </w:p>
+        </w:tc>
+        <w:tc>
+          <w:tcPr>
+            <w:tcW w:type="dxa" w:w="1826"/>
+            <w:tcBorders>
+              <w:top w:val="single" w:color="DDDDDD" w:sz="1"/>
+              <w:left w:val="single" w:color="DDDDDD" w:sz="1"/>
+              <w:bottom w:val="single" w:color="DDDDDD" w:sz="1"/>
+              <w:right w:val="single" w:color="DDDDDD" w:sz="1"/>
+            </w:tcBorders>
+            <w:shd w:fill="FFFFFF" w:val="clear"/>
+            <w:tcMar>
+              <w:top w:type="dxa" w:w="80"/>
+              <w:left w:type="dxa" w:w="130"/>
+              <w:bottom w:type="dxa" w:w="80"/>
+              <w:right w:type="dxa" w:w="130"/>
+            </w:tcMar>
+          </w:tcPr>
+          <w:p>
+            <w:r>
+              <w:rPr>
+                <w:rFonts w:ascii="Arial" w:cs="Arial" w:eastAsia="Arial" w:hAnsi="Arial"/>
+                <w:color w:val="1A1A1A"/>
+                <w:sz w:val="20"/>
+                <w:szCs w:val="20"/>
+              </w:rPr>
+              <w:t xml:space="preserve">3 056</w:t>
+            </w:r>
+          </w:p>
+        </w:tc>
+      </w:tr>
+      <w:tr>
+        <w:tc>
+          <w:tcPr>
+            <w:tcW w:type="dxa" w:w="2800"/>
+            <w:tcBorders>
+              <w:top w:val="single" w:color="DDDDDD" w:sz="1"/>
+              <w:left w:val="single" w:color="DDDDDD" w:sz="1"/>
+              <w:bottom w:val="single" w:color="DDDDDD" w:sz="1"/>
+              <w:right w:val="single" w:color="DDDDDD" w:sz="1"/>
+            </w:tcBorders>
+            <w:shd w:fill="F7F3ED" w:val="clear"/>
+            <w:tcMar>
+              <w:top w:type="dxa" w:w="80"/>
+              <w:left w:type="dxa" w:w="130"/>
+              <w:bottom w:type="dxa" w:w="80"/>
+              <w:right w:type="dxa" w:w="130"/>
+            </w:tcMar>
+          </w:tcPr>
+          <w:p>
+            <w:r>
+              <w:rPr>
+                <w:rFonts w:ascii="Arial" w:cs="Arial" w:eastAsia="Arial" w:hAnsi="Arial"/>
+                <w:color w:val="1A1A1A"/>
+                <w:sz w:val="20"/>
+                <w:szCs w:val="20"/>
+              </w:rPr>
+              <w:t xml:space="preserve">devis.css</w:t>
+            </w:r>
+          </w:p>
+        </w:tc>
+        <w:tc>
+          <w:tcPr>
+            <w:tcW w:type="dxa" w:w="4400"/>
+            <w:tcBorders>
+              <w:top w:val="single" w:color="DDDDDD" w:sz="1"/>
+              <w:left w:val="single" w:color="DDDDDD" w:sz="1"/>
+              <w:bottom w:val="single" w:color="DDDDDD" w:sz="1"/>
+              <w:right w:val="single" w:color="DDDDDD" w:sz="1"/>
+            </w:tcBorders>
+            <w:shd w:fill="F7F3ED" w:val="clear"/>
+            <w:tcMar>
+              <w:top w:type="dxa" w:w="80"/>
+              <w:left w:type="dxa" w:w="130"/>
+              <w:bottom w:type="dxa" w:w="80"/>
+              <w:right w:type="dxa" w:w="130"/>
+            </w:tcMar>
+          </w:tcPr>
+          <w:p>
+            <w:r>
+              <w:rPr>
+                <w:rFonts w:ascii="Arial" w:cs="Arial" w:eastAsia="Arial" w:hAnsi="Arial"/>
+                <w:color w:val="1A1A1A"/>
+                <w:sz w:val="20"/>
+                <w:szCs w:val="20"/>
+              </w:rPr>
+              <w:t xml:space="preserve">Styles du document devis (standalone)</w:t>
+            </w:r>
+          </w:p>
+        </w:tc>
+        <w:tc>
+          <w:tcPr>
+            <w:tcW w:type="dxa" w:w="1826"/>
+            <w:tcBorders>
+              <w:top w:val="single" w:color="DDDDDD" w:sz="1"/>
+              <w:left w:val="single" w:color="DDDDDD" w:sz="1"/>
+              <w:bottom w:val="single" w:color="DDDDDD" w:sz="1"/>
+              <w:right w:val="single" w:color="DDDDDD" w:sz="1"/>
+            </w:tcBorders>
+            <w:shd w:fill="F7F3ED" w:val="clear"/>
+            <w:tcMar>
+              <w:top w:type="dxa" w:w="80"/>
+              <w:left w:type="dxa" w:w="130"/>
+              <w:bottom w:type="dxa" w:w="80"/>
+              <w:right w:type="dxa" w:w="130"/>
+            </w:tcMar>
+          </w:tcPr>
+          <w:p>
+            <w:r>
+              <w:rPr>
+                <w:rFonts w:ascii="Arial" w:cs="Arial" w:eastAsia="Arial" w:hAnsi="Arial"/>
+                <w:color w:val="1A1A1A"/>
+                <w:sz w:val="20"/>
+                <w:szCs w:val="20"/>
+              </w:rPr>
+              <w:t xml:space="preserve">508</w:t>
+            </w:r>
+          </w:p>
+        </w:tc>
+      </w:tr>
+      <w:tr>
+        <w:tc>
+          <w:tcPr>
+            <w:tcW w:type="dxa" w:w="2800"/>
+            <w:tcBorders>
+              <w:top w:val="single" w:color="DDDDDD" w:sz="1"/>
+              <w:left w:val="single" w:color="DDDDDD" w:sz="1"/>
+              <w:bottom w:val="single" w:color="DDDDDD" w:sz="1"/>
+              <w:right w:val="single" w:color="DDDDDD" w:sz="1"/>
+            </w:tcBorders>
+            <w:shd w:fill="FFFFFF" w:val="clear"/>
+            <w:tcMar>
+              <w:top w:type="dxa" w:w="80"/>
+              <w:left w:type="dxa" w:w="130"/>
+              <w:bottom w:type="dxa" w:w="80"/>
+              <w:right w:type="dxa" w:w="130"/>
+            </w:tcMar>
+          </w:tcPr>
+          <w:p>
+            <w:r>
+              <w:rPr>
+                <w:rFonts w:ascii="Arial" w:cs="Arial" w:eastAsia="Arial" w:hAnsi="Arial"/>
+                <w:color w:val="1A1A1A"/>
+                <w:sz w:val="20"/>
+                <w:szCs w:val="20"/>
+              </w:rPr>
+              <w:t xml:space="preserve">main.js</w:t>
+            </w:r>
+          </w:p>
+        </w:tc>
+        <w:tc>
+          <w:tcPr>
+            <w:tcW w:type="dxa" w:w="4400"/>
+            <w:tcBorders>
+              <w:top w:val="single" w:color="DDDDDD" w:sz="1"/>
+              <w:left w:val="single" w:color="DDDDDD" w:sz="1"/>
+              <w:bottom w:val="single" w:color="DDDDDD" w:sz="1"/>
+              <w:right w:val="single" w:color="DDDDDD" w:sz="1"/>
+            </w:tcBorders>
+            <w:shd w:fill="FFFFFF" w:val="clear"/>
+            <w:tcMar>
+              <w:top w:type="dxa" w:w="80"/>
+              <w:left w:type="dxa" w:w="130"/>
+              <w:bottom w:type="dxa" w:w="80"/>
+              <w:right w:type="dxa" w:w="130"/>
+            </w:tcMar>
+          </w:tcPr>
+          <w:p>
+            <w:r>
+              <w:rPr>
+                <w:rFonts w:ascii="Arial" w:cs="Arial" w:eastAsia="Arial" w:hAnsi="Arial"/>
+                <w:color w:val="1A1A1A"/>
+                <w:sz w:val="20"/>
+                <w:szCs w:val="20"/>
+              </w:rPr>
+              <w:t xml:space="preserve">Logique principale — i18n, carousel, filtres, devise, animations</w:t>
+            </w:r>
+          </w:p>
+        </w:tc>
+        <w:tc>
+          <w:tcPr>
+            <w:tcW w:type="dxa" w:w="1826"/>
+            <w:tcBorders>
+              <w:top w:val="single" w:color="DDDDDD" w:sz="1"/>
+              <w:left w:val="single" w:color="DDDDDD" w:sz="1"/>
+              <w:bottom w:val="single" w:color="DDDDDD" w:sz="1"/>
+              <w:right w:val="single" w:color="DDDDDD" w:sz="1"/>
+            </w:tcBorders>
+            <w:shd w:fill="FFFFFF" w:val="clear"/>
+            <w:tcMar>
+              <w:top w:type="dxa" w:w="80"/>
+              <w:left w:type="dxa" w:w="130"/>
+              <w:bottom w:type="dxa" w:w="80"/>
+              <w:right w:type="dxa" w:w="130"/>
+            </w:tcMar>
+          </w:tcPr>
+          <w:p>
+            <w:r>
+              <w:rPr>
+                <w:rFonts w:ascii="Arial" w:cs="Arial" w:eastAsia="Arial" w:hAnsi="Arial"/>
+                <w:color w:val="1A1A1A"/>
+                <w:sz w:val="20"/>
+                <w:szCs w:val="20"/>
+              </w:rPr>
+              <w:t xml:space="preserve">1 723</w:t>
+            </w:r>
+          </w:p>
+        </w:tc>
+      </w:tr>
+      <w:tr>
+        <w:tc>
+          <w:tcPr>
+            <w:tcW w:type="dxa" w:w="2800"/>
+            <w:tcBorders>
+              <w:top w:val="single" w:color="DDDDDD" w:sz="1"/>
+              <w:left w:val="single" w:color="DDDDDD" w:sz="1"/>
+              <w:bottom w:val="single" w:color="DDDDDD" w:sz="1"/>
+              <w:right w:val="single" w:color="DDDDDD" w:sz="1"/>
+            </w:tcBorders>
+            <w:shd w:fill="F7F3ED" w:val="clear"/>
+            <w:tcMar>
+              <w:top w:type="dxa" w:w="80"/>
+              <w:left w:type="dxa" w:w="130"/>
+              <w:bottom w:type="dxa" w:w="80"/>
+              <w:right w:type="dxa" w:w="130"/>
+            </w:tcMar>
+          </w:tcPr>
+          <w:p>
+            <w:r>
+              <w:rPr>
+                <w:rFonts w:ascii="Arial" w:cs="Arial" w:eastAsia="Arial" w:hAnsi="Arial"/>
+                <w:color w:val="1A1A1A"/>
+                <w:sz w:val="20"/>
+                <w:szCs w:val="20"/>
+              </w:rPr>
+              <w:t xml:space="preserve">historique.js</w:t>
+            </w:r>
+          </w:p>
+        </w:tc>
+        <w:tc>
+          <w:tcPr>
+            <w:tcW w:type="dxa" w:w="4400"/>
+            <w:tcBorders>
+              <w:top w:val="single" w:color="DDDDDD" w:sz="1"/>
+              <w:left w:val="single" w:color="DDDDDD" w:sz="1"/>
+              <w:bottom w:val="single" w:color="DDDDDD" w:sz="1"/>
+              <w:right w:val="single" w:color="DDDDDD" w:sz="1"/>
+            </w:tcBorders>
+            <w:shd w:fill="F7F3ED" w:val="clear"/>
+            <w:tcMar>
+              <w:top w:type="dxa" w:w="80"/>
+              <w:left w:type="dxa" w:w="130"/>
+              <w:bottom w:type="dxa" w:w="80"/>
+              <w:right w:type="dxa" w:w="130"/>
+            </w:tcMar>
+          </w:tcPr>
+          <w:p>
+            <w:r>
+              <w:rPr>
+                <w:rFonts w:ascii="Arial" w:cs="Arial" w:eastAsia="Arial" w:hAnsi="Arial"/>
+                <w:color w:val="1A1A1A"/>
+                <w:sz w:val="20"/>
+                <w:szCs w:val="20"/>
+              </w:rPr>
+              <w:t xml:space="preserve">Logique admin — authentification, tri, CRUD devis</w:t>
+            </w:r>
+          </w:p>
+        </w:tc>
+        <w:tc>
+          <w:tcPr>
+            <w:tcW w:type="dxa" w:w="1826"/>
+            <w:tcBorders>
+              <w:top w:val="single" w:color="DDDDDD" w:sz="1"/>
+              <w:left w:val="single" w:color="DDDDDD" w:sz="1"/>
+              <w:bottom w:val="single" w:color="DDDDDD" w:sz="1"/>
+              <w:right w:val="single" w:color="DDDDDD" w:sz="1"/>
+            </w:tcBorders>
+            <w:shd w:fill="F7F3ED" w:val="clear"/>
+            <w:tcMar>
+              <w:top w:type="dxa" w:w="80"/>
+              <w:left w:type="dxa" w:w="130"/>
+              <w:bottom w:type="dxa" w:w="80"/>
+              <w:right w:type="dxa" w:w="130"/>
+            </w:tcMar>
+          </w:tcPr>
+          <w:p>
+            <w:r>
+              <w:rPr>
+                <w:rFonts w:ascii="Arial" w:cs="Arial" w:eastAsia="Arial" w:hAnsi="Arial"/>
+                <w:color w:val="1A1A1A"/>
+                <w:sz w:val="20"/>
+                <w:szCs w:val="20"/>
+              </w:rPr>
+              <w:t xml:space="preserve">255</w:t>
+            </w:r>
+          </w:p>
+        </w:tc>
+      </w:tr>
+      <w:tr>
+        <w:tc>
+          <w:tcPr>
+            <w:tcW w:type="dxa" w:w="2800"/>
+            <w:tcBorders>
+              <w:top w:val="single" w:color="DDDDDD" w:sz="1"/>
+              <w:left w:val="single" w:color="DDDDDD" w:sz="1"/>
+              <w:bottom w:val="single" w:color="DDDDDD" w:sz="1"/>
+              <w:right w:val="single" w:color="DDDDDD" w:sz="1"/>
+            </w:tcBorders>
+            <w:shd w:fill="FFFFFF" w:val="clear"/>
+            <w:tcMar>
+              <w:top w:type="dxa" w:w="80"/>
+              <w:left w:type="dxa" w:w="130"/>
+              <w:bottom w:type="dxa" w:w="80"/>
+              <w:right w:type="dxa" w:w="130"/>
+            </w:tcMar>
+          </w:tcPr>
+          <w:p>
+            <w:r>
+              <w:rPr>
+                <w:rFonts w:ascii="Arial" w:cs="Arial" w:eastAsia="Arial" w:hAnsi="Arial"/>
+                <w:color w:val="1A1A1A"/>
+                <w:sz w:val="20"/>
+                <w:szCs w:val="20"/>
+              </w:rPr>
+              <w:t xml:space="preserve">HTML (16 pages)</w:t>
+            </w:r>
+          </w:p>
+        </w:tc>
+        <w:tc>
+          <w:tcPr>
+            <w:tcW w:type="dxa" w:w="4400"/>
+            <w:tcBorders>
+              <w:top w:val="single" w:color="DDDDDD" w:sz="1"/>
+              <w:left w:val="single" w:color="DDDDDD" w:sz="1"/>
+              <w:bottom w:val="single" w:color="DDDDDD" w:sz="1"/>
+              <w:right w:val="single" w:color="DDDDDD" w:sz="1"/>
+            </w:tcBorders>
+            <w:shd w:fill="FFFFFF" w:val="clear"/>
+            <w:tcMar>
+              <w:top w:type="dxa" w:w="80"/>
+              <w:left w:type="dxa" w:w="130"/>
+              <w:bottom w:type="dxa" w:w="80"/>
+              <w:right w:type="dxa" w:w="130"/>
+            </w:tcMar>
+          </w:tcPr>
+          <w:p>
+            <w:r>
+              <w:rPr>
+                <w:rFonts w:ascii="Arial" w:cs="Arial" w:eastAsia="Arial" w:hAnsi="Arial"/>
+                <w:color w:val="1A1A1A"/>
+                <w:sz w:val="20"/>
+                <w:szCs w:val="20"/>
+              </w:rPr>
+              <w:t xml:space="preserve">Structure sémantique complète</w:t>
+            </w:r>
+          </w:p>
+        </w:tc>
+        <w:tc>
+          <w:tcPr>
+            <w:tcW w:type="dxa" w:w="1826"/>
+            <w:tcBorders>
+              <w:top w:val="single" w:color="DDDDDD" w:sz="1"/>
+              <w:left w:val="single" w:color="DDDDDD" w:sz="1"/>
+              <w:bottom w:val="single" w:color="DDDDDD" w:sz="1"/>
+              <w:right w:val="single" w:color="DDDDDD" w:sz="1"/>
+            </w:tcBorders>
+            <w:shd w:fill="FFFFFF" w:val="clear"/>
+            <w:tcMar>
+              <w:top w:type="dxa" w:w="80"/>
+              <w:left w:type="dxa" w:w="130"/>
+              <w:bottom w:type="dxa" w:w="80"/>
+              <w:right w:type="dxa" w:w="130"/>
+            </w:tcMar>
+          </w:tcPr>
+          <w:p>
+            <w:r>
+              <w:rPr>
+                <w:rFonts w:ascii="Arial" w:cs="Arial" w:eastAsia="Arial" w:hAnsi="Arial"/>
+                <w:color w:val="1A1A1A"/>
+                <w:sz w:val="20"/>
+                <w:szCs w:val="20"/>
+              </w:rPr>
+              <w:t xml:space="preserve">5 661</w:t>
+            </w:r>
+          </w:p>
+        </w:tc>
+      </w:tr>
+      <w:tr>
+        <w:tc>
+          <w:tcPr>
+            <w:tcW w:type="dxa" w:w="2800"/>
+            <w:tcBorders>
+              <w:top w:val="single" w:color="DDDDDD" w:sz="1"/>
+              <w:left w:val="single" w:color="DDDDDD" w:sz="1"/>
+              <w:bottom w:val="single" w:color="DDDDDD" w:sz="1"/>
+              <w:right w:val="single" w:color="DDDDDD" w:sz="1"/>
+            </w:tcBorders>
+            <w:shd w:fill="F7F3ED" w:val="clear"/>
+            <w:tcMar>
+              <w:top w:type="dxa" w:w="80"/>
+              <w:left w:type="dxa" w:w="130"/>
+              <w:bottom w:type="dxa" w:w="80"/>
+              <w:right w:type="dxa" w:w="130"/>
+            </w:tcMar>
+          </w:tcPr>
+          <w:p>
+            <w:r>
+              <w:rPr>
+                <w:rFonts w:ascii="Arial" w:cs="Arial" w:eastAsia="Arial" w:hAnsi="Arial"/>
+                <w:color w:val="1A1A1A"/>
+                <w:sz w:val="20"/>
+                <w:szCs w:val="20"/>
+              </w:rPr>
+              <w:t xml:space="preserve">TOTAL</w:t>
+            </w:r>
+          </w:p>
+        </w:tc>
+        <w:tc>
+          <w:tcPr>
+            <w:tcW w:type="dxa" w:w="4400"/>
+            <w:tcBorders>
+              <w:top w:val="single" w:color="DDDDDD" w:sz="1"/>
+              <w:left w:val="single" w:color="DDDDDD" w:sz="1"/>
+              <w:bottom w:val="single" w:color="DDDDDD" w:sz="1"/>
+              <w:right w:val="single" w:color="DDDDDD" w:sz="1"/>
+            </w:tcBorders>
+            <w:shd w:fill="F7F3ED" w:val="clear"/>
+            <w:tcMar>
+              <w:top w:type="dxa" w:w="80"/>
+              <w:left w:type="dxa" w:w="130"/>
+              <w:bottom w:type="dxa" w:w="80"/>
+              <w:right w:type="dxa" w:w="130"/>
+            </w:tcMar>
+          </w:tcPr>
+          <w:p>
+            <w:r>
+              <w:rPr>
+                <w:rFonts w:ascii="Arial" w:cs="Arial" w:eastAsia="Arial" w:hAnsi="Arial"/>
+                <w:color w:val="1A1A1A"/>
+                <w:sz w:val="20"/>
+                <w:szCs w:val="20"/>
+              </w:rPr>
+              <w:t xml:space="preserve">Volume de code source</w:t>
+            </w:r>
+          </w:p>
+        </w:tc>
+        <w:tc>
+          <w:tcPr>
+            <w:tcW w:type="dxa" w:w="1826"/>
+            <w:tcBorders>
+              <w:top w:val="single" w:color="DDDDDD" w:sz="1"/>
+              <w:left w:val="single" w:color="DDDDDD" w:sz="1"/>
+              <w:bottom w:val="single" w:color="DDDDDD" w:sz="1"/>
+              <w:right w:val="single" w:color="DDDDDD" w:sz="1"/>
+            </w:tcBorders>
+            <w:shd w:fill="F7F3ED" w:val="clear"/>
+            <w:tcMar>
+              <w:top w:type="dxa" w:w="80"/>
+              <w:left w:type="dxa" w:w="130"/>
+              <w:bottom w:type="dxa" w:w="80"/>
+              <w:right w:type="dxa" w:w="130"/>
+            </w:tcMar>
+          </w:tcPr>
+          <w:p>
+            <w:r>
+              <w:rPr>
+                <w:rFonts w:ascii="Arial" w:cs="Arial" w:eastAsia="Arial" w:hAnsi="Arial"/>
+                <w:color w:val="1A1A1A"/>
+                <w:sz w:val="20"/>
+                <w:szCs w:val="20"/>
+              </w:rPr>
+              <w:t xml:space="preserve">11 203</w:t>
+            </w:r>
+          </w:p>
+        </w:tc>
+      </w:tr>
+    </w:tbl>
     <w:p>
       <w:pPr>
-        <w:spacing w:after="90" w:before="60"/>
+        <w:spacing w:after="120" w:before="0"/>
       </w:pPr>
       <w:r>
-        <w:rPr>
-          <w:rFonts w:ascii="Arial" w:cs="Arial" w:eastAsia="Arial" w:hAnsi="Arial"/>
-          <w:color w:val="1A1A1A"/>
-          <w:sz w:val="21"/>
-          <w:szCs w:val="21"/>
-        </w:rPr>
-        <w:t xml:space="preserve">Technologies : HTML5, CSS3, JavaScript vanilla (ES6+), sans framework ni CMS.</w:t>
+        <w:t xml:space="preserve"/>
       </w:r>
     </w:p>
     <w:p>
@@ -1637,7 +3285,7 @@
           <w:sz w:val="21"/>
           <w:szCs w:val="21"/>
         </w:rPr>
-        <w:t xml:space="preserve">Volume de code : ~6 000 lignes (2 129 CSS / 1 633 JS / ~2 000 HTML).</w:t>
+        <w:t xml:space="preserve">Technologies : HTML5, CSS3, JavaScript Vanilla ES6+. Aucun framework, aucun CMS, aucune dépendance externe.</w:t>
       </w:r>
     </w:p>
     <w:p>
@@ -1654,6 +3302,80 @@
         <w:t xml:space="preserve">Charte graphique : Bordeaux #4D0F1C, Or #C9A84C, Crème #FAF7F2 — typographies Playfair Display &amp; Raleway.</w:t>
       </w:r>
     </w:p>
+    <w:p>
+      <w:pPr>
+        <w:spacing w:after="120" w:before="0"/>
+      </w:pPr>
+      <w:r>
+        <w:t xml:space="preserve"/>
+      </w:r>
+    </w:p>
+    <w:tbl>
+      <w:tblPr>
+        <w:tblW w:type="dxa" w:w="9026"/>
+        <w:tblBorders>
+          <w:top w:val="single" w:color="auto" w:sz="4"/>
+          <w:left w:val="single" w:color="auto" w:sz="4"/>
+          <w:bottom w:val="single" w:color="auto" w:sz="4"/>
+          <w:right w:val="single" w:color="auto" w:sz="4"/>
+          <w:insideH w:val="single" w:color="auto" w:sz="4"/>
+          <w:insideV w:val="single" w:color="auto" w:sz="4"/>
+        </w:tblBorders>
+      </w:tblPr>
+      <w:tblGrid>
+        <w:gridCol w:w="9026"/>
+      </w:tblGrid>
+      <w:tr>
+        <w:tc>
+          <w:tcPr>
+            <w:tcW w:type="dxa" w:w="9026"/>
+            <w:tcBorders>
+              <w:top w:val="single" w:color="C9A84C" w:sz="1"/>
+              <w:left w:val="single" w:color="4D0F1C" w:sz="12"/>
+              <w:bottom w:val="single" w:color="C9A84C" w:sz="1"/>
+              <w:right w:val="single" w:color="F5EDE0" w:sz="1"/>
+            </w:tcBorders>
+            <w:shd w:fill="F5EDE0" w:val="clear"/>
+            <w:tcMar>
+              <w:top w:type="dxa" w:w="120"/>
+              <w:left w:type="dxa" w:w="200"/>
+              <w:bottom w:type="dxa" w:w="120"/>
+              <w:right w:type="dxa" w:w="200"/>
+            </w:tcMar>
+          </w:tcPr>
+          <w:p>
+            <w:pPr>
+              <w:spacing w:after="60" w:before="0"/>
+            </w:pPr>
+            <w:r>
+              <w:rPr>
+                <w:rFonts w:ascii="Arial" w:cs="Arial" w:eastAsia="Arial" w:hAnsi="Arial"/>
+                <w:b/>
+                <w:bCs/>
+                <w:color w:val="4D0F1C"/>
+                <w:sz w:val="20"/>
+                <w:szCs w:val="20"/>
+              </w:rPr>
+              <w:t xml:space="preserve">Architecture CSS propre</w:t>
+            </w:r>
+          </w:p>
+          <w:p>
+            <w:pPr>
+              <w:spacing w:after="0" w:before="0"/>
+            </w:pPr>
+            <w:r>
+              <w:rPr>
+                <w:rFonts w:ascii="Arial" w:cs="Arial" w:eastAsia="Arial" w:hAnsi="Arial"/>
+                <w:color w:val="1A1A1A"/>
+                <w:sz w:val="20"/>
+                <w:szCs w:val="20"/>
+              </w:rPr>
+              <w:t xml:space="preserve">Aucune balise &lt;style&gt; dans les fichiers HTML. Tout le CSS est externalisé dans style.css et devis.css, garantissant une maintenance facile et des performances optimales.</w:t>
+            </w:r>
+          </w:p>
+        </w:tc>
+      </w:tr>
+    </w:tbl>
     <w:p>
       <w:pPr>
         <w:spacing w:after="120" w:before="0"/>
@@ -2262,7 +3984,7 @@
                 <w:sz w:val="20"/>
                 <w:szCs w:val="20"/>
               </w:rPr>
-              <w:t xml:space="preserve">Développement complet (6 pages)</w:t>
+              <w:t xml:space="preserve">Développement pages principales (6)</w:t>
             </w:r>
           </w:p>
         </w:tc>
@@ -2322,7 +4044,7 @@
                 <w:sz w:val="20"/>
                 <w:szCs w:val="20"/>
               </w:rPr>
-              <w:t xml:space="preserve">Tests, optimisation, mise en ligne</w:t>
+              <w:t xml:space="preserve">Développement pages articles, devis, admin, 404, confidentialité</w:t>
             </w:r>
           </w:p>
         </w:tc>
@@ -2351,7 +4073,7 @@
                 <w:sz w:val="20"/>
                 <w:szCs w:val="20"/>
               </w:rPr>
-              <w:t xml:space="preserve">2-3 jours</w:t>
+              <w:t xml:space="preserve">3-4 jours</w:t>
             </w:r>
           </w:p>
         </w:tc>
@@ -2382,7 +4104,7 @@
                 <w:sz w:val="20"/>
                 <w:szCs w:val="20"/>
               </w:rPr>
-              <w:t xml:space="preserve">Livraison finale</w:t>
+              <w:t xml:space="preserve">Optimisation cross-browser, responsive, accessibilité</w:t>
             </w:r>
           </w:p>
         </w:tc>
@@ -2411,7 +4133,127 @@
                 <w:sz w:val="20"/>
                 <w:szCs w:val="20"/>
               </w:rPr>
-              <w:t xml:space="preserve">Jour 14 maximum</w:t>
+              <w:t xml:space="preserve">1-2 jours</w:t>
+            </w:r>
+          </w:p>
+        </w:tc>
+      </w:tr>
+      <w:tr>
+        <w:tc>
+          <w:tcPr>
+            <w:tcW w:type="dxa" w:w="5500"/>
+            <w:tcBorders>
+              <w:top w:val="single" w:color="DDDDDD" w:sz="1"/>
+              <w:left w:val="single" w:color="DDDDDD" w:sz="1"/>
+              <w:bottom w:val="single" w:color="DDDDDD" w:sz="1"/>
+              <w:right w:val="single" w:color="DDDDDD" w:sz="1"/>
+            </w:tcBorders>
+            <w:shd w:fill="FFFFFF" w:val="clear"/>
+            <w:tcMar>
+              <w:top w:type="dxa" w:w="80"/>
+              <w:left w:type="dxa" w:w="130"/>
+              <w:bottom w:type="dxa" w:w="80"/>
+              <w:right w:type="dxa" w:w="130"/>
+            </w:tcMar>
+          </w:tcPr>
+          <w:p>
+            <w:r>
+              <w:rPr>
+                <w:rFonts w:ascii="Arial" w:cs="Arial" w:eastAsia="Arial" w:hAnsi="Arial"/>
+                <w:color w:val="1A1A1A"/>
+                <w:sz w:val="20"/>
+                <w:szCs w:val="20"/>
+              </w:rPr>
+              <w:t xml:space="preserve">Tests, mise en ligne, livraison</w:t>
+            </w:r>
+          </w:p>
+        </w:tc>
+        <w:tc>
+          <w:tcPr>
+            <w:tcW w:type="dxa" w:w="3526"/>
+            <w:tcBorders>
+              <w:top w:val="single" w:color="DDDDDD" w:sz="1"/>
+              <w:left w:val="single" w:color="DDDDDD" w:sz="1"/>
+              <w:bottom w:val="single" w:color="DDDDDD" w:sz="1"/>
+              <w:right w:val="single" w:color="DDDDDD" w:sz="1"/>
+            </w:tcBorders>
+            <w:shd w:fill="FFFFFF" w:val="clear"/>
+            <w:tcMar>
+              <w:top w:type="dxa" w:w="80"/>
+              <w:left w:type="dxa" w:w="130"/>
+              <w:bottom w:type="dxa" w:w="80"/>
+              <w:right w:type="dxa" w:w="130"/>
+            </w:tcMar>
+          </w:tcPr>
+          <w:p>
+            <w:r>
+              <w:rPr>
+                <w:rFonts w:ascii="Arial" w:cs="Arial" w:eastAsia="Arial" w:hAnsi="Arial"/>
+                <w:color w:val="1A1A1A"/>
+                <w:sz w:val="20"/>
+                <w:szCs w:val="20"/>
+              </w:rPr>
+              <w:t xml:space="preserve">1-2 jours</w:t>
+            </w:r>
+          </w:p>
+        </w:tc>
+      </w:tr>
+      <w:tr>
+        <w:tc>
+          <w:tcPr>
+            <w:tcW w:type="dxa" w:w="5500"/>
+            <w:tcBorders>
+              <w:top w:val="single" w:color="DDDDDD" w:sz="1"/>
+              <w:left w:val="single" w:color="DDDDDD" w:sz="1"/>
+              <w:bottom w:val="single" w:color="DDDDDD" w:sz="1"/>
+              <w:right w:val="single" w:color="DDDDDD" w:sz="1"/>
+            </w:tcBorders>
+            <w:shd w:fill="F7F3ED" w:val="clear"/>
+            <w:tcMar>
+              <w:top w:type="dxa" w:w="80"/>
+              <w:left w:type="dxa" w:w="130"/>
+              <w:bottom w:type="dxa" w:w="80"/>
+              <w:right w:type="dxa" w:w="130"/>
+            </w:tcMar>
+          </w:tcPr>
+          <w:p>
+            <w:r>
+              <w:rPr>
+                <w:rFonts w:ascii="Arial" w:cs="Arial" w:eastAsia="Arial" w:hAnsi="Arial"/>
+                <w:color w:val="1A1A1A"/>
+                <w:sz w:val="20"/>
+                <w:szCs w:val="20"/>
+              </w:rPr>
+              <w:t xml:space="preserve">TOTAL</w:t>
+            </w:r>
+          </w:p>
+        </w:tc>
+        <w:tc>
+          <w:tcPr>
+            <w:tcW w:type="dxa" w:w="3526"/>
+            <w:tcBorders>
+              <w:top w:val="single" w:color="DDDDDD" w:sz="1"/>
+              <w:left w:val="single" w:color="DDDDDD" w:sz="1"/>
+              <w:bottom w:val="single" w:color="DDDDDD" w:sz="1"/>
+              <w:right w:val="single" w:color="DDDDDD" w:sz="1"/>
+            </w:tcBorders>
+            <w:shd w:fill="F7F3ED" w:val="clear"/>
+            <w:tcMar>
+              <w:top w:type="dxa" w:w="80"/>
+              <w:left w:type="dxa" w:w="130"/>
+              <w:bottom w:type="dxa" w:w="80"/>
+              <w:right w:type="dxa" w:w="130"/>
+            </w:tcMar>
+          </w:tcPr>
+          <w:p>
+            <w:r>
+              <w:rPr>
+                <w:rFonts w:ascii="Arial" w:cs="Arial" w:eastAsia="Arial" w:hAnsi="Arial"/>
+                <w:color w:val="1A1A1A"/>
+                <w:sz w:val="20"/>
+                <w:szCs w:val="20"/>
+              </w:rPr>
+              <w:t xml:space="preserve">14-20 jours ouvrables</w:t>
             </w:r>
           </w:p>
         </w:tc>
@@ -2677,7 +4519,7 @@
                 <w:sz w:val="20"/>
                 <w:szCs w:val="20"/>
               </w:rPr>
-              <w:t xml:space="preserve">Conception &amp; développement (6 pages)</w:t>
+              <w:t xml:space="preserve">Conception &amp; développement (16 pages)</w:t>
             </w:r>
           </w:p>
         </w:tc>
@@ -2706,7 +4548,7 @@
                 <w:sz w:val="20"/>
                 <w:szCs w:val="20"/>
               </w:rPr>
-              <w:t xml:space="preserve">250 000</w:t>
+              <w:t xml:space="preserve">350 000</w:t>
             </w:r>
           </w:p>
         </w:tc>
@@ -2735,7 +4577,7 @@
                 <w:sz w:val="20"/>
                 <w:szCs w:val="20"/>
               </w:rPr>
-              <w:t xml:space="preserve">~381 €</w:t>
+              <w:t xml:space="preserve">~534 €</w:t>
             </w:r>
           </w:p>
         </w:tc>
@@ -2855,6 +4697,273 @@
                 <w:sz w:val="20"/>
                 <w:szCs w:val="20"/>
               </w:rPr>
+              <w:t xml:space="preserve">Système devis + admin sécurisé</w:t>
+            </w:r>
+          </w:p>
+        </w:tc>
+        <w:tc>
+          <w:tcPr>
+            <w:tcW w:type="dxa" w:w="2500"/>
+            <w:tcBorders>
+              <w:top w:val="single" w:color="DDDDDD" w:sz="1"/>
+              <w:left w:val="single" w:color="DDDDDD" w:sz="1"/>
+              <w:bottom w:val="single" w:color="DDDDDD" w:sz="1"/>
+              <w:right w:val="single" w:color="DDDDDD" w:sz="1"/>
+            </w:tcBorders>
+            <w:shd w:fill="FFFFFF" w:val="clear"/>
+            <w:tcMar>
+              <w:top w:type="dxa" w:w="80"/>
+              <w:left w:type="dxa" w:w="130"/>
+              <w:bottom w:type="dxa" w:w="80"/>
+              <w:right w:type="dxa" w:w="130"/>
+            </w:tcMar>
+          </w:tcPr>
+          <w:p>
+            <w:r>
+              <w:rPr>
+                <w:rFonts w:ascii="Arial" w:cs="Arial" w:eastAsia="Arial" w:hAnsi="Arial"/>
+                <w:color w:val="1A1A1A"/>
+                <w:sz w:val="20"/>
+                <w:szCs w:val="20"/>
+              </w:rPr>
+              <w:t xml:space="preserve">40 000</w:t>
+            </w:r>
+          </w:p>
+        </w:tc>
+        <w:tc>
+          <w:tcPr>
+            <w:tcW w:type="dxa" w:w="2026"/>
+            <w:tcBorders>
+              <w:top w:val="single" w:color="DDDDDD" w:sz="1"/>
+              <w:left w:val="single" w:color="DDDDDD" w:sz="1"/>
+              <w:bottom w:val="single" w:color="DDDDDD" w:sz="1"/>
+              <w:right w:val="single" w:color="DDDDDD" w:sz="1"/>
+            </w:tcBorders>
+            <w:shd w:fill="FFFFFF" w:val="clear"/>
+            <w:tcMar>
+              <w:top w:type="dxa" w:w="80"/>
+              <w:left w:type="dxa" w:w="130"/>
+              <w:bottom w:type="dxa" w:w="80"/>
+              <w:right w:type="dxa" w:w="130"/>
+            </w:tcMar>
+          </w:tcPr>
+          <w:p>
+            <w:r>
+              <w:rPr>
+                <w:rFonts w:ascii="Arial" w:cs="Arial" w:eastAsia="Arial" w:hAnsi="Arial"/>
+                <w:color w:val="1A1A1A"/>
+                <w:sz w:val="20"/>
+                <w:szCs w:val="20"/>
+              </w:rPr>
+              <w:t xml:space="preserve">~61 €</w:t>
+            </w:r>
+          </w:p>
+        </w:tc>
+      </w:tr>
+      <w:tr>
+        <w:tc>
+          <w:tcPr>
+            <w:tcW w:type="dxa" w:w="4500"/>
+            <w:tcBorders>
+              <w:top w:val="single" w:color="DDDDDD" w:sz="1"/>
+              <w:left w:val="single" w:color="DDDDDD" w:sz="1"/>
+              <w:bottom w:val="single" w:color="DDDDDD" w:sz="1"/>
+              <w:right w:val="single" w:color="DDDDDD" w:sz="1"/>
+            </w:tcBorders>
+            <w:shd w:fill="F7F3ED" w:val="clear"/>
+            <w:tcMar>
+              <w:top w:type="dxa" w:w="80"/>
+              <w:left w:type="dxa" w:w="130"/>
+              <w:bottom w:type="dxa" w:w="80"/>
+              <w:right w:type="dxa" w:w="130"/>
+            </w:tcMar>
+          </w:tcPr>
+          <w:p>
+            <w:r>
+              <w:rPr>
+                <w:rFonts w:ascii="Arial" w:cs="Arial" w:eastAsia="Arial" w:hAnsi="Arial"/>
+                <w:color w:val="1A1A1A"/>
+                <w:sz w:val="20"/>
+                <w:szCs w:val="20"/>
+              </w:rPr>
+              <w:t xml:space="preserve">Conformité légale (RGPD, CCPA, Malabo)</w:t>
+            </w:r>
+          </w:p>
+        </w:tc>
+        <w:tc>
+          <w:tcPr>
+            <w:tcW w:type="dxa" w:w="2500"/>
+            <w:tcBorders>
+              <w:top w:val="single" w:color="DDDDDD" w:sz="1"/>
+              <w:left w:val="single" w:color="DDDDDD" w:sz="1"/>
+              <w:bottom w:val="single" w:color="DDDDDD" w:sz="1"/>
+              <w:right w:val="single" w:color="DDDDDD" w:sz="1"/>
+            </w:tcBorders>
+            <w:shd w:fill="F7F3ED" w:val="clear"/>
+            <w:tcMar>
+              <w:top w:type="dxa" w:w="80"/>
+              <w:left w:type="dxa" w:w="130"/>
+              <w:bottom w:type="dxa" w:w="80"/>
+              <w:right w:type="dxa" w:w="130"/>
+            </w:tcMar>
+          </w:tcPr>
+          <w:p>
+            <w:r>
+              <w:rPr>
+                <w:rFonts w:ascii="Arial" w:cs="Arial" w:eastAsia="Arial" w:hAnsi="Arial"/>
+                <w:color w:val="1A1A1A"/>
+                <w:sz w:val="20"/>
+                <w:szCs w:val="20"/>
+              </w:rPr>
+              <w:t xml:space="preserve">20 000</w:t>
+            </w:r>
+          </w:p>
+        </w:tc>
+        <w:tc>
+          <w:tcPr>
+            <w:tcW w:type="dxa" w:w="2026"/>
+            <w:tcBorders>
+              <w:top w:val="single" w:color="DDDDDD" w:sz="1"/>
+              <w:left w:val="single" w:color="DDDDDD" w:sz="1"/>
+              <w:bottom w:val="single" w:color="DDDDDD" w:sz="1"/>
+              <w:right w:val="single" w:color="DDDDDD" w:sz="1"/>
+            </w:tcBorders>
+            <w:shd w:fill="F7F3ED" w:val="clear"/>
+            <w:tcMar>
+              <w:top w:type="dxa" w:w="80"/>
+              <w:left w:type="dxa" w:w="130"/>
+              <w:bottom w:type="dxa" w:w="80"/>
+              <w:right w:type="dxa" w:w="130"/>
+            </w:tcMar>
+          </w:tcPr>
+          <w:p>
+            <w:r>
+              <w:rPr>
+                <w:rFonts w:ascii="Arial" w:cs="Arial" w:eastAsia="Arial" w:hAnsi="Arial"/>
+                <w:color w:val="1A1A1A"/>
+                <w:sz w:val="20"/>
+                <w:szCs w:val="20"/>
+              </w:rPr>
+              <w:t xml:space="preserve">~31 €</w:t>
+            </w:r>
+          </w:p>
+        </w:tc>
+      </w:tr>
+      <w:tr>
+        <w:tc>
+          <w:tcPr>
+            <w:tcW w:type="dxa" w:w="4500"/>
+            <w:tcBorders>
+              <w:top w:val="single" w:color="DDDDDD" w:sz="1"/>
+              <w:left w:val="single" w:color="DDDDDD" w:sz="1"/>
+              <w:bottom w:val="single" w:color="DDDDDD" w:sz="1"/>
+              <w:right w:val="single" w:color="DDDDDD" w:sz="1"/>
+            </w:tcBorders>
+            <w:shd w:fill="FFFFFF" w:val="clear"/>
+            <w:tcMar>
+              <w:top w:type="dxa" w:w="80"/>
+              <w:left w:type="dxa" w:w="130"/>
+              <w:bottom w:type="dxa" w:w="80"/>
+              <w:right w:type="dxa" w:w="130"/>
+            </w:tcMar>
+          </w:tcPr>
+          <w:p>
+            <w:r>
+              <w:rPr>
+                <w:rFonts w:ascii="Arial" w:cs="Arial" w:eastAsia="Arial" w:hAnsi="Arial"/>
+                <w:color w:val="1A1A1A"/>
+                <w:sz w:val="20"/>
+                <w:szCs w:val="20"/>
+              </w:rPr>
+              <w:t xml:space="preserve">Optimisation cross-browser &amp; accessibilité</w:t>
+            </w:r>
+          </w:p>
+        </w:tc>
+        <w:tc>
+          <w:tcPr>
+            <w:tcW w:type="dxa" w:w="2500"/>
+            <w:tcBorders>
+              <w:top w:val="single" w:color="DDDDDD" w:sz="1"/>
+              <w:left w:val="single" w:color="DDDDDD" w:sz="1"/>
+              <w:bottom w:val="single" w:color="DDDDDD" w:sz="1"/>
+              <w:right w:val="single" w:color="DDDDDD" w:sz="1"/>
+            </w:tcBorders>
+            <w:shd w:fill="FFFFFF" w:val="clear"/>
+            <w:tcMar>
+              <w:top w:type="dxa" w:w="80"/>
+              <w:left w:type="dxa" w:w="130"/>
+              <w:bottom w:type="dxa" w:w="80"/>
+              <w:right w:type="dxa" w:w="130"/>
+            </w:tcMar>
+          </w:tcPr>
+          <w:p>
+            <w:r>
+              <w:rPr>
+                <w:rFonts w:ascii="Arial" w:cs="Arial" w:eastAsia="Arial" w:hAnsi="Arial"/>
+                <w:color w:val="1A1A1A"/>
+                <w:sz w:val="20"/>
+                <w:szCs w:val="20"/>
+              </w:rPr>
+              <w:t xml:space="preserve">20 000</w:t>
+            </w:r>
+          </w:p>
+        </w:tc>
+        <w:tc>
+          <w:tcPr>
+            <w:tcW w:type="dxa" w:w="2026"/>
+            <w:tcBorders>
+              <w:top w:val="single" w:color="DDDDDD" w:sz="1"/>
+              <w:left w:val="single" w:color="DDDDDD" w:sz="1"/>
+              <w:bottom w:val="single" w:color="DDDDDD" w:sz="1"/>
+              <w:right w:val="single" w:color="DDDDDD" w:sz="1"/>
+            </w:tcBorders>
+            <w:shd w:fill="FFFFFF" w:val="clear"/>
+            <w:tcMar>
+              <w:top w:type="dxa" w:w="80"/>
+              <w:left w:type="dxa" w:w="130"/>
+              <w:bottom w:type="dxa" w:w="80"/>
+              <w:right w:type="dxa" w:w="130"/>
+            </w:tcMar>
+          </w:tcPr>
+          <w:p>
+            <w:r>
+              <w:rPr>
+                <w:rFonts w:ascii="Arial" w:cs="Arial" w:eastAsia="Arial" w:hAnsi="Arial"/>
+                <w:color w:val="1A1A1A"/>
+                <w:sz w:val="20"/>
+                <w:szCs w:val="20"/>
+              </w:rPr>
+              <w:t xml:space="preserve">~31 €</w:t>
+            </w:r>
+          </w:p>
+        </w:tc>
+      </w:tr>
+      <w:tr>
+        <w:tc>
+          <w:tcPr>
+            <w:tcW w:type="dxa" w:w="4500"/>
+            <w:tcBorders>
+              <w:top w:val="single" w:color="DDDDDD" w:sz="1"/>
+              <w:left w:val="single" w:color="DDDDDD" w:sz="1"/>
+              <w:bottom w:val="single" w:color="DDDDDD" w:sz="1"/>
+              <w:right w:val="single" w:color="DDDDDD" w:sz="1"/>
+            </w:tcBorders>
+            <w:shd w:fill="F7F3ED" w:val="clear"/>
+            <w:tcMar>
+              <w:top w:type="dxa" w:w="80"/>
+              <w:left w:type="dxa" w:w="130"/>
+              <w:bottom w:type="dxa" w:w="80"/>
+              <w:right w:type="dxa" w:w="130"/>
+            </w:tcMar>
+          </w:tcPr>
+          <w:p>
+            <w:r>
+              <w:rPr>
+                <w:rFonts w:ascii="Arial" w:cs="Arial" w:eastAsia="Arial" w:hAnsi="Arial"/>
+                <w:color w:val="1A1A1A"/>
+                <w:sz w:val="20"/>
+                <w:szCs w:val="20"/>
+              </w:rPr>
               <w:t xml:space="preserve">Nom de domaine .com (2 ans)</w:t>
             </w:r>
           </w:p>
@@ -2868,7 +4977,7 @@
               <w:bottom w:val="single" w:color="DDDDDD" w:sz="1"/>
               <w:right w:val="single" w:color="DDDDDD" w:sz="1"/>
             </w:tcBorders>
-            <w:shd w:fill="FFFFFF" w:val="clear"/>
+            <w:shd w:fill="F7F3ED" w:val="clear"/>
             <w:tcMar>
               <w:top w:type="dxa" w:w="80"/>
               <w:left w:type="dxa" w:w="130"/>
@@ -2897,7 +5006,7 @@
               <w:bottom w:val="single" w:color="DDDDDD" w:sz="1"/>
               <w:right w:val="single" w:color="DDDDDD" w:sz="1"/>
             </w:tcBorders>
-            <w:shd w:fill="FFFFFF" w:val="clear"/>
+            <w:shd w:fill="F7F3ED" w:val="clear"/>
             <w:tcMar>
               <w:top w:type="dxa" w:w="80"/>
               <w:left w:type="dxa" w:w="130"/>
@@ -2928,6 +5037,95 @@
               <w:bottom w:val="single" w:color="DDDDDD" w:sz="1"/>
               <w:right w:val="single" w:color="DDDDDD" w:sz="1"/>
             </w:tcBorders>
+            <w:shd w:fill="FFFFFF" w:val="clear"/>
+            <w:tcMar>
+              <w:top w:type="dxa" w:w="80"/>
+              <w:left w:type="dxa" w:w="130"/>
+              <w:bottom w:type="dxa" w:w="80"/>
+              <w:right w:type="dxa" w:w="130"/>
+            </w:tcMar>
+          </w:tcPr>
+          <w:p>
+            <w:r>
+              <w:rPr>
+                <w:rFonts w:ascii="Arial" w:cs="Arial" w:eastAsia="Arial" w:hAnsi="Arial"/>
+                <w:color w:val="1A1A1A"/>
+                <w:sz w:val="20"/>
+                <w:szCs w:val="20"/>
+              </w:rPr>
+              <w:t xml:space="preserve">Hébergement web Premium (2 ans)</w:t>
+            </w:r>
+          </w:p>
+        </w:tc>
+        <w:tc>
+          <w:tcPr>
+            <w:tcW w:type="dxa" w:w="2500"/>
+            <w:tcBorders>
+              <w:top w:val="single" w:color="DDDDDD" w:sz="1"/>
+              <w:left w:val="single" w:color="DDDDDD" w:sz="1"/>
+              <w:bottom w:val="single" w:color="DDDDDD" w:sz="1"/>
+              <w:right w:val="single" w:color="DDDDDD" w:sz="1"/>
+            </w:tcBorders>
+            <w:shd w:fill="FFFFFF" w:val="clear"/>
+            <w:tcMar>
+              <w:top w:type="dxa" w:w="80"/>
+              <w:left w:type="dxa" w:w="130"/>
+              <w:bottom w:type="dxa" w:w="80"/>
+              <w:right w:type="dxa" w:w="130"/>
+            </w:tcMar>
+          </w:tcPr>
+          <w:p>
+            <w:r>
+              <w:rPr>
+                <w:rFonts w:ascii="Arial" w:cs="Arial" w:eastAsia="Arial" w:hAnsi="Arial"/>
+                <w:color w:val="1A1A1A"/>
+                <w:sz w:val="20"/>
+                <w:szCs w:val="20"/>
+              </w:rPr>
+              <w:t xml:space="preserve">55 000</w:t>
+            </w:r>
+          </w:p>
+        </w:tc>
+        <w:tc>
+          <w:tcPr>
+            <w:tcW w:type="dxa" w:w="2026"/>
+            <w:tcBorders>
+              <w:top w:val="single" w:color="DDDDDD" w:sz="1"/>
+              <w:left w:val="single" w:color="DDDDDD" w:sz="1"/>
+              <w:bottom w:val="single" w:color="DDDDDD" w:sz="1"/>
+              <w:right w:val="single" w:color="DDDDDD" w:sz="1"/>
+            </w:tcBorders>
+            <w:shd w:fill="FFFFFF" w:val="clear"/>
+            <w:tcMar>
+              <w:top w:type="dxa" w:w="80"/>
+              <w:left w:type="dxa" w:w="130"/>
+              <w:bottom w:type="dxa" w:w="80"/>
+              <w:right w:type="dxa" w:w="130"/>
+            </w:tcMar>
+          </w:tcPr>
+          <w:p>
+            <w:r>
+              <w:rPr>
+                <w:rFonts w:ascii="Arial" w:cs="Arial" w:eastAsia="Arial" w:hAnsi="Arial"/>
+                <w:color w:val="1A1A1A"/>
+                <w:sz w:val="20"/>
+                <w:szCs w:val="20"/>
+              </w:rPr>
+              <w:t xml:space="preserve">~84 €</w:t>
+            </w:r>
+          </w:p>
+        </w:tc>
+      </w:tr>
+      <w:tr>
+        <w:tc>
+          <w:tcPr>
+            <w:tcW w:type="dxa" w:w="4500"/>
+            <w:tcBorders>
+              <w:top w:val="single" w:color="DDDDDD" w:sz="1"/>
+              <w:left w:val="single" w:color="DDDDDD" w:sz="1"/>
+              <w:bottom w:val="single" w:color="DDDDDD" w:sz="1"/>
+              <w:right w:val="single" w:color="DDDDDD" w:sz="1"/>
+            </w:tcBorders>
             <w:shd w:fill="F7F3ED" w:val="clear"/>
             <w:tcMar>
               <w:top w:type="dxa" w:w="80"/>
@@ -2944,7 +5142,7 @@
                 <w:sz w:val="20"/>
                 <w:szCs w:val="20"/>
               </w:rPr>
-              <w:t xml:space="preserve">Hébergement web Premium (2 ans)</w:t>
+              <w:t xml:space="preserve">Maintenance &amp; support (2 ans)</w:t>
             </w:r>
           </w:p>
         </w:tc>
@@ -2973,7 +5171,7 @@
                 <w:sz w:val="20"/>
                 <w:szCs w:val="20"/>
               </w:rPr>
-              <w:t xml:space="preserve">55 000</w:t>
+              <w:t xml:space="preserve">60 000</w:t>
             </w:r>
           </w:p>
         </w:tc>
@@ -2987,95 +5185,6 @@
               <w:right w:val="single" w:color="DDDDDD" w:sz="1"/>
             </w:tcBorders>
             <w:shd w:fill="F7F3ED" w:val="clear"/>
-            <w:tcMar>
-              <w:top w:type="dxa" w:w="80"/>
-              <w:left w:type="dxa" w:w="130"/>
-              <w:bottom w:type="dxa" w:w="80"/>
-              <w:right w:type="dxa" w:w="130"/>
-            </w:tcMar>
-          </w:tcPr>
-          <w:p>
-            <w:r>
-              <w:rPr>
-                <w:rFonts w:ascii="Arial" w:cs="Arial" w:eastAsia="Arial" w:hAnsi="Arial"/>
-                <w:color w:val="1A1A1A"/>
-                <w:sz w:val="20"/>
-                <w:szCs w:val="20"/>
-              </w:rPr>
-              <w:t xml:space="preserve">~84 €</w:t>
-            </w:r>
-          </w:p>
-        </w:tc>
-      </w:tr>
-      <w:tr>
-        <w:tc>
-          <w:tcPr>
-            <w:tcW w:type="dxa" w:w="4500"/>
-            <w:tcBorders>
-              <w:top w:val="single" w:color="DDDDDD" w:sz="1"/>
-              <w:left w:val="single" w:color="DDDDDD" w:sz="1"/>
-              <w:bottom w:val="single" w:color="DDDDDD" w:sz="1"/>
-              <w:right w:val="single" w:color="DDDDDD" w:sz="1"/>
-            </w:tcBorders>
-            <w:shd w:fill="FFFFFF" w:val="clear"/>
-            <w:tcMar>
-              <w:top w:type="dxa" w:w="80"/>
-              <w:left w:type="dxa" w:w="130"/>
-              <w:bottom w:type="dxa" w:w="80"/>
-              <w:right w:type="dxa" w:w="130"/>
-            </w:tcMar>
-          </w:tcPr>
-          <w:p>
-            <w:r>
-              <w:rPr>
-                <w:rFonts w:ascii="Arial" w:cs="Arial" w:eastAsia="Arial" w:hAnsi="Arial"/>
-                <w:color w:val="1A1A1A"/>
-                <w:sz w:val="20"/>
-                <w:szCs w:val="20"/>
-              </w:rPr>
-              <w:t xml:space="preserve">Maintenance &amp; support (2 ans)</w:t>
-            </w:r>
-          </w:p>
-        </w:tc>
-        <w:tc>
-          <w:tcPr>
-            <w:tcW w:type="dxa" w:w="2500"/>
-            <w:tcBorders>
-              <w:top w:val="single" w:color="DDDDDD" w:sz="1"/>
-              <w:left w:val="single" w:color="DDDDDD" w:sz="1"/>
-              <w:bottom w:val="single" w:color="DDDDDD" w:sz="1"/>
-              <w:right w:val="single" w:color="DDDDDD" w:sz="1"/>
-            </w:tcBorders>
-            <w:shd w:fill="FFFFFF" w:val="clear"/>
-            <w:tcMar>
-              <w:top w:type="dxa" w:w="80"/>
-              <w:left w:type="dxa" w:w="130"/>
-              <w:bottom w:type="dxa" w:w="80"/>
-              <w:right w:type="dxa" w:w="130"/>
-            </w:tcMar>
-          </w:tcPr>
-          <w:p>
-            <w:r>
-              <w:rPr>
-                <w:rFonts w:ascii="Arial" w:cs="Arial" w:eastAsia="Arial" w:hAnsi="Arial"/>
-                <w:color w:val="1A1A1A"/>
-                <w:sz w:val="20"/>
-                <w:szCs w:val="20"/>
-              </w:rPr>
-              <w:t xml:space="preserve">60 000</w:t>
-            </w:r>
-          </w:p>
-        </w:tc>
-        <w:tc>
-          <w:tcPr>
-            <w:tcW w:type="dxa" w:w="2026"/>
-            <w:tcBorders>
-              <w:top w:val="single" w:color="DDDDDD" w:sz="1"/>
-              <w:left w:val="single" w:color="DDDDDD" w:sz="1"/>
-              <w:bottom w:val="single" w:color="DDDDDD" w:sz="1"/>
-              <w:right w:val="single" w:color="DDDDDD" w:sz="1"/>
-            </w:tcBorders>
-            <w:shd w:fill="FFFFFF" w:val="clear"/>
             <w:tcMar>
               <w:top w:type="dxa" w:w="80"/>
               <w:left w:type="dxa" w:w="130"/>
@@ -3155,7 +5264,7 @@
                 <w:sz w:val="20"/>
                 <w:szCs w:val="20"/>
               </w:rPr>
-              <w:t xml:space="preserve">Développement &amp; Design</w:t>
+              <w:t xml:space="preserve">Développement &amp; Design (16 pages + fonctionnalités)</w:t>
             </w:r>
             <w:r>
               <w:rPr>
@@ -3172,7 +5281,7 @@
                 <w:sz w:val="20"/>
                 <w:szCs w:val="20"/>
               </w:rPr>
-              <w:t xml:space="preserve">300 000 FCFA</w:t>
+              <w:t xml:space="preserve">480 000 FCFA</w:t>
             </w:r>
           </w:p>
           <w:p>
@@ -3283,7 +5392,7 @@
                 <w:sz w:val="28"/>
                 <w:szCs w:val="28"/>
               </w:rPr>
-              <w:t xml:space="preserve">433 000 FCFA  (~660 €)</w:t>
+              <w:t xml:space="preserve">613 000 FCFA  (~935 €)</w:t>
             </w:r>
           </w:p>
         </w:tc>
@@ -3484,7 +5593,7 @@
                 <w:sz w:val="20"/>
                 <w:szCs w:val="20"/>
               </w:rPr>
-              <w:t xml:space="preserve">216 500 FCFA</w:t>
+              <w:t xml:space="preserve">306 500 FCFA</w:t>
             </w:r>
           </w:p>
         </w:tc>
@@ -3573,7 +5682,7 @@
                 <w:sz w:val="20"/>
                 <w:szCs w:val="20"/>
               </w:rPr>
-              <w:t xml:space="preserve">216 500 FCFA</w:t>
+              <w:t xml:space="preserve">306 500 FCFA</w:t>
             </w:r>
           </w:p>
         </w:tc>
@@ -3698,7 +5807,7 @@
                 <w:sz w:val="20"/>
                 <w:szCs w:val="20"/>
               </w:rPr>
-              <w:t xml:space="preserve">Ce cahier des charges et le devis associé (N° AWF-2026-001) sont valables 30 jours, soit jusqu'au 12 juin 2026.</w:t>
+              <w:t xml:space="preserve">Ce cahier des charges et le devis associé (N° AWF-2026-001) sont valables 30 jours, soit jusqu'au 14 juin 2026.</w:t>
             </w:r>
           </w:p>
         </w:tc>

</xml_diff>